<commit_message>
fix(template): CCVS table moved to follow task table, renderer indices updated
</commit_message>
<xml_diff>
--- a/src/SWMS-260306-V1.docx
+++ b/src/SWMS-260306-V1.docx
@@ -34,16 +34,7 @@
           <w:sz w:val="28"/>
           <w:szCs w:val="28"/>
         </w:rPr>
-        <w:t xml:space="preserve">Description: </w:t>
-      </w:r>
-      <w:r>
-        <w:rPr>
-          <w:rFonts w:ascii="Aptos" w:hAnsi="Aptos" w:cstheme="majorHAnsi"/>
-          <w:b/>
-          <w:sz w:val="28"/>
-          <w:szCs w:val="28"/>
-        </w:rPr>
-        <w:t>[Insert description here]</w:t>
+        <w:t>Description: [Insert description here]</w:t>
       </w:r>
     </w:p>
     <w:tbl>
@@ -179,29 +170,7 @@
                 <w:sz w:val="20"/>
                 <w:szCs w:val="20"/>
               </w:rPr>
-              <w:t xml:space="preserve">[Insert PCBU </w:t>
-            </w:r>
-            <w:r>
-              <w:rPr>
-                <w:rFonts w:ascii="Aptos" w:hAnsi="Aptos"/>
-                <w:i/>
-                <w:iCs/>
-                <w:color w:val="000000" w:themeColor="text1"/>
-                <w:sz w:val="20"/>
-                <w:szCs w:val="20"/>
-              </w:rPr>
-              <w:t>h</w:t>
-            </w:r>
-            <w:r>
-              <w:rPr>
-                <w:rFonts w:ascii="Aptos" w:hAnsi="Aptos"/>
-                <w:i/>
-                <w:iCs/>
-                <w:color w:val="000000" w:themeColor="text1"/>
-                <w:sz w:val="20"/>
-                <w:szCs w:val="20"/>
-              </w:rPr>
-              <w:t>ere]</w:t>
+              <w:t>[Insert PCBU here]</w:t>
             </w:r>
           </w:p>
         </w:tc>
@@ -384,9 +353,135 @@
                 <w:sz w:val="20"/>
                 <w:szCs w:val="20"/>
               </w:rPr>
-              <w:t xml:space="preserve"> [Insert </w:t>
-            </w:r>
-            <w:r>
+              <w:t xml:space="preserve"> [Insert Manager name here]</w:t>
+            </w:r>
+          </w:p>
+        </w:tc>
+        <w:tc>
+          <w:tcPr>
+            <w:tcW w:w="1560" w:type="dxa"/>
+            <w:shd w:val="clear" w:color="auto" w:fill="DBE5F1"/>
+          </w:tcPr>
+          <w:p>
+            <w:pPr>
+              <w:spacing w:line="240" w:lineRule="auto"/>
+              <w:jc w:val="right"/>
+              <w:rPr>
+                <w:rFonts w:ascii="Aptos" w:hAnsi="Aptos"/>
+                <w:b/>
+                <w:bCs/>
+                <w:sz w:val="16"/>
+                <w:szCs w:val="16"/>
+              </w:rPr>
+            </w:pPr>
+            <w:r>
+              <w:rPr>
+                <w:rFonts w:ascii="Aptos" w:hAnsi="Aptos"/>
+                <w:b/>
+                <w:bCs/>
+                <w:sz w:val="16"/>
+                <w:szCs w:val="16"/>
+              </w:rPr>
+              <w:t>Date SWMS provided to PC:</w:t>
+            </w:r>
+          </w:p>
+        </w:tc>
+        <w:tc>
+          <w:tcPr>
+            <w:tcW w:w="3118" w:type="dxa"/>
+          </w:tcPr>
+          <w:p>
+            <w:pPr>
+              <w:spacing w:line="240" w:lineRule="auto"/>
+              <w:rPr>
+                <w:rFonts w:ascii="Aptos" w:hAnsi="Aptos"/>
+                <w:b/>
+                <w:bCs/>
+                <w:i/>
+                <w:iCs/>
+                <w:sz w:val="18"/>
+                <w:szCs w:val="18"/>
+              </w:rPr>
+            </w:pPr>
+            <w:r>
+              <w:rPr>
+                <w:rFonts w:ascii="Aptos" w:hAnsi="Aptos"/>
+                <w:b/>
+                <w:bCs/>
+                <w:i/>
+                <w:iCs/>
+                <w:sz w:val="18"/>
+                <w:szCs w:val="18"/>
+              </w:rPr>
+              <w:t>■</w:t>
+            </w:r>
+            <w:r>
+              <w:rPr>
+                <w:rFonts w:ascii="Aptos" w:hAnsi="Aptos" w:cstheme="majorHAnsi"/>
+                <w:b/>
+                <w:bCs/>
+                <w:i/>
+                <w:iCs/>
+                <w:sz w:val="18"/>
+                <w:szCs w:val="18"/>
+              </w:rPr>
+              <w:t xml:space="preserve"> Date: </w:t>
+            </w:r>
+            <w:r>
+              <w:rPr>
+                <w:rFonts w:ascii="Aptos" w:hAnsi="Aptos" w:cstheme="majorHAnsi"/>
+                <w:i/>
+                <w:iCs/>
+                <w:color w:val="444444"/>
+                <w:sz w:val="18"/>
+                <w:szCs w:val="18"/>
+              </w:rPr>
+              <w:t>[Insert Date Here]</w:t>
+            </w:r>
+          </w:p>
+        </w:tc>
+      </w:tr>
+      <w:tr>
+        <w:trPr>
+          <w:cantSplit/>
+        </w:trPr>
+        <w:tc>
+          <w:tcPr>
+            <w:tcW w:w="1829" w:type="dxa"/>
+            <w:shd w:val="clear" w:color="auto" w:fill="DBE5F1"/>
+          </w:tcPr>
+          <w:p>
+            <w:pPr>
+              <w:spacing w:line="240" w:lineRule="auto"/>
+              <w:jc w:val="right"/>
+              <w:rPr>
+                <w:rFonts w:ascii="Aptos" w:hAnsi="Aptos" w:cstheme="majorHAnsi"/>
+                <w:b/>
+                <w:bCs/>
+                <w:sz w:val="20"/>
+                <w:szCs w:val="20"/>
+              </w:rPr>
+            </w:pPr>
+            <w:r>
+              <w:rPr>
+                <w:rFonts w:ascii="Aptos" w:hAnsi="Aptos" w:cstheme="majorHAnsi"/>
+                <w:b/>
+                <w:bCs/>
+                <w:sz w:val="20"/>
+                <w:szCs w:val="20"/>
+              </w:rPr>
+              <w:t>Work Activity:</w:t>
+            </w:r>
+          </w:p>
+        </w:tc>
+        <w:tc>
+          <w:tcPr>
+            <w:tcW w:w="8939" w:type="dxa"/>
+            <w:gridSpan w:val="4"/>
+          </w:tcPr>
+          <w:p>
+            <w:pPr>
+              <w:spacing w:line="240" w:lineRule="auto"/>
               <w:rPr>
                 <w:rFonts w:ascii="Aptos" w:hAnsi="Aptos" w:cstheme="majorHAnsi"/>
                 <w:i/>
@@ -395,7 +490,17 @@
                 <w:sz w:val="20"/>
                 <w:szCs w:val="20"/>
               </w:rPr>
-              <w:t>Manager name</w:t>
+            </w:pPr>
+            <w:r>
+              <w:rPr>
+                <w:rFonts w:ascii="Aptos" w:hAnsi="Aptos"/>
+                <w:i/>
+                <w:iCs/>
+                <w:color w:val="000000" w:themeColor="text1"/>
+                <w:sz w:val="20"/>
+                <w:szCs w:val="20"/>
+              </w:rPr>
+              <w:t>■</w:t>
             </w:r>
             <w:r>
               <w:rPr>
@@ -411,13 +516,14 @@
             <w:r>
               <w:rPr>
                 <w:rFonts w:ascii="Aptos" w:hAnsi="Aptos" w:cstheme="majorHAnsi"/>
+                <w:b/>
                 <w:i/>
                 <w:iCs/>
                 <w:color w:val="000000" w:themeColor="text1"/>
                 <w:sz w:val="20"/>
                 <w:szCs w:val="20"/>
               </w:rPr>
-              <w:t>h</w:t>
+              <w:t>Work Activity:</w:t>
             </w:r>
             <w:r>
               <w:rPr>
@@ -428,7 +534,7 @@
                 <w:sz w:val="20"/>
                 <w:szCs w:val="20"/>
               </w:rPr>
-              <w:t>ere]</w:t>
+              <w:t xml:space="preserve"> [Insert work activity here]</w:t>
             </w:r>
           </w:p>
         </w:tc>
@@ -457,7 +563,7 @@
                 <w:sz w:val="16"/>
                 <w:szCs w:val="16"/>
               </w:rPr>
-              <w:t>Date SWMS provided to PC:</w:t>
+              <w:t>Principal Contractor (PC):</w:t>
             </w:r>
           </w:p>
         </w:tc>
@@ -469,7 +575,7 @@
             <w:pPr>
               <w:spacing w:line="240" w:lineRule="auto"/>
               <w:rPr>
-                <w:rFonts w:ascii="Aptos" w:hAnsi="Aptos"/>
+                <w:rFonts w:ascii="Aptos" w:hAnsi="Aptos" w:cstheme="majorHAnsi"/>
                 <w:b/>
                 <w:bCs/>
                 <w:i/>
@@ -500,7 +606,7 @@
                 <w:sz w:val="18"/>
                 <w:szCs w:val="18"/>
               </w:rPr>
-              <w:t xml:space="preserve"> Date: </w:t>
+              <w:t xml:space="preserve"> PC: </w:t>
             </w:r>
             <w:r>
               <w:rPr>
@@ -511,7 +617,7 @@
                 <w:sz w:val="18"/>
                 <w:szCs w:val="18"/>
               </w:rPr>
-              <w:t>[Insert Date Here]</w:t>
+              <w:t>[Insert Principal Contractor Name Here]</w:t>
             </w:r>
           </w:p>
         </w:tc>
@@ -523,14 +629,14 @@
         <w:tc>
           <w:tcPr>
             <w:tcW w:w="1829" w:type="dxa"/>
+            <w:vMerge w:val="restart"/>
             <w:shd w:val="clear" w:color="auto" w:fill="DBE5F1"/>
           </w:tcPr>
           <w:p>
             <w:pPr>
-              <w:spacing w:line="240" w:lineRule="auto"/>
               <w:jc w:val="right"/>
               <w:rPr>
-                <w:rFonts w:ascii="Aptos" w:hAnsi="Aptos" w:cstheme="majorHAnsi"/>
+                <w:rFonts w:ascii="Aptos" w:hAnsi="Aptos"/>
                 <w:b/>
                 <w:bCs/>
                 <w:sz w:val="20"/>
@@ -539,314 +645,12 @@
             </w:pPr>
             <w:r>
               <w:rPr>
-                <w:rFonts w:ascii="Aptos" w:hAnsi="Aptos" w:cstheme="majorHAnsi"/>
+                <w:rFonts w:ascii="Aptos" w:hAnsi="Aptos"/>
                 <w:b/>
                 <w:bCs/>
                 <w:sz w:val="20"/>
                 <w:szCs w:val="20"/>
               </w:rPr>
-              <w:t xml:space="preserve">Work </w:t>
-            </w:r>
-            <w:r>
-              <w:rPr>
-                <w:rFonts w:ascii="Aptos" w:hAnsi="Aptos" w:cstheme="majorHAnsi"/>
-                <w:b/>
-                <w:bCs/>
-                <w:sz w:val="20"/>
-                <w:szCs w:val="20"/>
-              </w:rPr>
-              <w:t>A</w:t>
-            </w:r>
-            <w:r>
-              <w:rPr>
-                <w:rFonts w:ascii="Aptos" w:hAnsi="Aptos" w:cstheme="majorHAnsi"/>
-                <w:b/>
-                <w:bCs/>
-                <w:sz w:val="20"/>
-                <w:szCs w:val="20"/>
-              </w:rPr>
-              <w:t>ctivity:</w:t>
-            </w:r>
-          </w:p>
-        </w:tc>
-        <w:tc>
-          <w:tcPr>
-            <w:tcW w:w="8939" w:type="dxa"/>
-            <w:gridSpan w:val="4"/>
-          </w:tcPr>
-          <w:p>
-            <w:pPr>
-              <w:spacing w:line="240" w:lineRule="auto"/>
-              <w:rPr>
-                <w:rFonts w:ascii="Aptos" w:hAnsi="Aptos" w:cstheme="majorHAnsi"/>
-                <w:i/>
-                <w:iCs/>
-                <w:color w:val="000000" w:themeColor="text1"/>
-                <w:sz w:val="20"/>
-                <w:szCs w:val="20"/>
-              </w:rPr>
-            </w:pPr>
-            <w:r>
-              <w:rPr>
-                <w:rFonts w:ascii="Aptos" w:hAnsi="Aptos"/>
-                <w:i/>
-                <w:iCs/>
-                <w:color w:val="000000" w:themeColor="text1"/>
-                <w:sz w:val="20"/>
-                <w:szCs w:val="20"/>
-              </w:rPr>
-              <w:t>■</w:t>
-            </w:r>
-            <w:r>
-              <w:rPr>
-                <w:rFonts w:ascii="Aptos" w:hAnsi="Aptos" w:cstheme="majorHAnsi"/>
-                <w:i/>
-                <w:iCs/>
-                <w:color w:val="000000" w:themeColor="text1"/>
-                <w:sz w:val="20"/>
-                <w:szCs w:val="20"/>
-              </w:rPr>
-              <w:t xml:space="preserve"> </w:t>
-            </w:r>
-            <w:r>
-              <w:rPr>
-                <w:rFonts w:ascii="Aptos" w:hAnsi="Aptos" w:cstheme="majorHAnsi"/>
-                <w:b/>
-                <w:i/>
-                <w:iCs/>
-                <w:color w:val="000000" w:themeColor="text1"/>
-                <w:sz w:val="20"/>
-                <w:szCs w:val="20"/>
-              </w:rPr>
-              <w:t>Work</w:t>
-            </w:r>
-            <w:r>
-              <w:rPr>
-                <w:rFonts w:ascii="Aptos" w:hAnsi="Aptos" w:cstheme="majorHAnsi"/>
-                <w:b/>
-                <w:i/>
-                <w:iCs/>
-                <w:color w:val="000000" w:themeColor="text1"/>
-                <w:sz w:val="20"/>
-                <w:szCs w:val="20"/>
-              </w:rPr>
-              <w:t xml:space="preserve"> Activity</w:t>
-            </w:r>
-            <w:r>
-              <w:rPr>
-                <w:rFonts w:ascii="Aptos" w:hAnsi="Aptos" w:cstheme="majorHAnsi"/>
-                <w:b/>
-                <w:i/>
-                <w:iCs/>
-                <w:color w:val="000000" w:themeColor="text1"/>
-                <w:sz w:val="20"/>
-                <w:szCs w:val="20"/>
-              </w:rPr>
-              <w:t>:</w:t>
-            </w:r>
-            <w:r>
-              <w:rPr>
-                <w:rFonts w:ascii="Aptos" w:hAnsi="Aptos" w:cstheme="majorHAnsi"/>
-                <w:i/>
-                <w:iCs/>
-                <w:color w:val="000000" w:themeColor="text1"/>
-                <w:sz w:val="20"/>
-                <w:szCs w:val="20"/>
-              </w:rPr>
-              <w:t xml:space="preserve"> [</w:t>
-            </w:r>
-            <w:r>
-              <w:rPr>
-                <w:rFonts w:ascii="Aptos" w:hAnsi="Aptos" w:cstheme="majorHAnsi"/>
-                <w:i/>
-                <w:iCs/>
-                <w:color w:val="000000" w:themeColor="text1"/>
-                <w:sz w:val="20"/>
-                <w:szCs w:val="20"/>
-              </w:rPr>
-              <w:t xml:space="preserve">Insert </w:t>
-            </w:r>
-            <w:r>
-              <w:rPr>
-                <w:rFonts w:ascii="Aptos" w:hAnsi="Aptos" w:cstheme="majorHAnsi"/>
-                <w:i/>
-                <w:iCs/>
-                <w:color w:val="000000" w:themeColor="text1"/>
-                <w:sz w:val="20"/>
-                <w:szCs w:val="20"/>
-              </w:rPr>
-              <w:t>work activity</w:t>
-            </w:r>
-            <w:r>
-              <w:rPr>
-                <w:rFonts w:ascii="Aptos" w:hAnsi="Aptos" w:cstheme="majorHAnsi"/>
-                <w:i/>
-                <w:iCs/>
-                <w:color w:val="000000" w:themeColor="text1"/>
-                <w:sz w:val="20"/>
-                <w:szCs w:val="20"/>
-              </w:rPr>
-              <w:t xml:space="preserve"> here]</w:t>
-            </w:r>
-          </w:p>
-        </w:tc>
-        <w:tc>
-          <w:tcPr>
-            <w:tcW w:w="1560" w:type="dxa"/>
-            <w:shd w:val="clear" w:color="auto" w:fill="DBE5F1"/>
-          </w:tcPr>
-          <w:p>
-            <w:pPr>
-              <w:spacing w:line="240" w:lineRule="auto"/>
-              <w:jc w:val="right"/>
-              <w:rPr>
-                <w:rFonts w:ascii="Aptos" w:hAnsi="Aptos"/>
-                <w:b/>
-                <w:bCs/>
-                <w:sz w:val="16"/>
-                <w:szCs w:val="16"/>
-              </w:rPr>
-            </w:pPr>
-            <w:r>
-              <w:rPr>
-                <w:rFonts w:ascii="Aptos" w:hAnsi="Aptos"/>
-                <w:b/>
-                <w:bCs/>
-                <w:sz w:val="16"/>
-                <w:szCs w:val="16"/>
-              </w:rPr>
-              <w:t>Principal Contractor (PC):</w:t>
-            </w:r>
-          </w:p>
-        </w:tc>
-        <w:tc>
-          <w:tcPr>
-            <w:tcW w:w="3118" w:type="dxa"/>
-          </w:tcPr>
-          <w:p>
-            <w:pPr>
-              <w:spacing w:line="240" w:lineRule="auto"/>
-              <w:rPr>
-                <w:rFonts w:ascii="Aptos" w:hAnsi="Aptos" w:cstheme="majorHAnsi"/>
-                <w:b/>
-                <w:bCs/>
-                <w:i/>
-                <w:iCs/>
-                <w:sz w:val="18"/>
-                <w:szCs w:val="18"/>
-              </w:rPr>
-            </w:pPr>
-            <w:r>
-              <w:rPr>
-                <w:rFonts w:ascii="Aptos" w:hAnsi="Aptos"/>
-                <w:b/>
-                <w:bCs/>
-                <w:i/>
-                <w:iCs/>
-                <w:sz w:val="18"/>
-                <w:szCs w:val="18"/>
-              </w:rPr>
-              <w:t>■</w:t>
-            </w:r>
-            <w:r>
-              <w:rPr>
-                <w:rFonts w:ascii="Aptos" w:hAnsi="Aptos" w:cstheme="majorHAnsi"/>
-                <w:b/>
-                <w:bCs/>
-                <w:i/>
-                <w:iCs/>
-                <w:sz w:val="18"/>
-                <w:szCs w:val="18"/>
-              </w:rPr>
-              <w:t xml:space="preserve"> PC: </w:t>
-            </w:r>
-            <w:r>
-              <w:rPr>
-                <w:rFonts w:ascii="Aptos" w:hAnsi="Aptos" w:cstheme="majorHAnsi"/>
-                <w:i/>
-                <w:iCs/>
-                <w:color w:val="444444"/>
-                <w:sz w:val="18"/>
-                <w:szCs w:val="18"/>
-              </w:rPr>
-              <w:t>[Insert Principal Contract</w:t>
-            </w:r>
-            <w:r>
-              <w:rPr>
-                <w:rFonts w:ascii="Aptos" w:hAnsi="Aptos" w:cstheme="majorHAnsi"/>
-                <w:i/>
-                <w:iCs/>
-                <w:color w:val="444444"/>
-                <w:sz w:val="18"/>
-                <w:szCs w:val="18"/>
-              </w:rPr>
-              <w:t xml:space="preserve">or </w:t>
-            </w:r>
-            <w:r>
-              <w:rPr>
-                <w:rFonts w:ascii="Aptos" w:hAnsi="Aptos" w:cstheme="majorHAnsi"/>
-                <w:i/>
-                <w:iCs/>
-                <w:color w:val="444444"/>
-                <w:sz w:val="18"/>
-                <w:szCs w:val="18"/>
-              </w:rPr>
-              <w:t xml:space="preserve">Name </w:t>
-            </w:r>
-            <w:r>
-              <w:rPr>
-                <w:rFonts w:ascii="Aptos" w:hAnsi="Aptos" w:cstheme="majorHAnsi"/>
-                <w:i/>
-                <w:iCs/>
-                <w:color w:val="444444"/>
-                <w:sz w:val="18"/>
-                <w:szCs w:val="18"/>
-              </w:rPr>
-              <w:t>Here</w:t>
-            </w:r>
-            <w:r>
-              <w:rPr>
-                <w:rFonts w:ascii="Aptos" w:hAnsi="Aptos" w:cstheme="majorHAnsi"/>
-                <w:i/>
-                <w:iCs/>
-                <w:color w:val="444444"/>
-                <w:sz w:val="18"/>
-                <w:szCs w:val="18"/>
-              </w:rPr>
-              <w:t>]</w:t>
-            </w:r>
-          </w:p>
-        </w:tc>
-      </w:tr>
-      <w:tr>
-        <w:trPr>
-          <w:cantSplit/>
-        </w:trPr>
-        <w:tc>
-          <w:tcPr>
-            <w:tcW w:w="1829" w:type="dxa"/>
-            <w:vMerge w:val="restart"/>
-            <w:shd w:val="clear" w:color="auto" w:fill="DBE5F1"/>
-          </w:tcPr>
-          <w:p>
-            <w:pPr>
-              <w:jc w:val="right"/>
-              <w:rPr>
-                <w:rFonts w:ascii="Aptos" w:hAnsi="Aptos"/>
-                <w:b/>
-                <w:bCs/>
-                <w:sz w:val="20"/>
-                <w:szCs w:val="20"/>
-              </w:rPr>
-            </w:pPr>
-            <w:r>
-              <w:rPr>
-                <w:rFonts w:ascii="Aptos" w:hAnsi="Aptos"/>
-                <w:b/>
-                <w:bCs/>
-                <w:sz w:val="20"/>
-                <w:szCs w:val="20"/>
-              </w:rPr>
               <w:t xml:space="preserve">High Risk Construction Work (HRCW) </w:t>
             </w:r>
           </w:p>
@@ -878,15 +682,7 @@
                 <w:rFonts w:ascii="Aptos" w:hAnsi="Aptos" w:cs="Aptos"/>
                 <w:sz w:val="16"/>
               </w:rPr>
-              <w:t xml:space="preserve"> </w:t>
-            </w:r>
-            <w:proofErr w:type="gramStart"/>
-            <w:r>
-              <w:rPr>
-                <w:rFonts w:ascii="Aptos" w:hAnsi="Aptos" w:cs="Aptos"/>
-                <w:sz w:val="16"/>
-              </w:rPr>
-              <w:t xml:space="preserve">  </w:t>
+              <w:t xml:space="preserve">   </w:t>
             </w:r>
             <w:r>
               <w:rPr>
@@ -894,16 +690,7 @@
                 <w:sz w:val="16"/>
                 <w:szCs w:val="16"/>
               </w:rPr>
-              <w:t>]</w:t>
-            </w:r>
-            <w:proofErr w:type="gramEnd"/>
-            <w:r>
-              <w:rPr>
-                <w:rFonts w:ascii="Aptos" w:hAnsi="Aptos" w:cstheme="majorHAnsi"/>
-                <w:sz w:val="16"/>
-                <w:szCs w:val="16"/>
-              </w:rPr>
-              <w:t xml:space="preserve"> Risk of a person falling more than 2 metres </w:t>
+              <w:t xml:space="preserve">] Risk of a person falling more than 2 metres </w:t>
             </w:r>
           </w:p>
           <w:p>
@@ -938,25 +725,7 @@
                 <w:sz w:val="16"/>
                 <w:szCs w:val="16"/>
               </w:rPr>
-              <w:t xml:space="preserve">[ </w:t>
-            </w:r>
-            <w:proofErr w:type="gramStart"/>
-            <w:r>
-              <w:rPr>
-                <w:rFonts w:ascii="Aptos" w:hAnsi="Aptos" w:cstheme="majorHAnsi"/>
-                <w:sz w:val="16"/>
-                <w:szCs w:val="16"/>
-              </w:rPr>
-              <w:t xml:space="preserve">  ]</w:t>
-            </w:r>
-            <w:proofErr w:type="gramEnd"/>
-            <w:r>
-              <w:rPr>
-                <w:rFonts w:ascii="Aptos" w:hAnsi="Aptos" w:cstheme="majorHAnsi"/>
-                <w:sz w:val="16"/>
-                <w:szCs w:val="16"/>
-              </w:rPr>
-              <w:t xml:space="preserve"> Work on a telecommunication tower</w:t>
+              <w:t>[   ] Work on a telecommunication tower</w:t>
             </w:r>
           </w:p>
         </w:tc>
@@ -981,25 +750,7 @@
                 <w:sz w:val="16"/>
                 <w:szCs w:val="16"/>
               </w:rPr>
-              <w:t xml:space="preserve">[ </w:t>
-            </w:r>
-            <w:proofErr w:type="gramStart"/>
-            <w:r>
-              <w:rPr>
-                <w:rFonts w:ascii="Aptos" w:hAnsi="Aptos" w:cstheme="majorHAnsi"/>
-                <w:sz w:val="16"/>
-                <w:szCs w:val="16"/>
-              </w:rPr>
-              <w:t xml:space="preserve">  ]</w:t>
-            </w:r>
-            <w:proofErr w:type="gramEnd"/>
-            <w:r>
-              <w:rPr>
-                <w:rFonts w:ascii="Aptos" w:hAnsi="Aptos" w:cstheme="majorHAnsi"/>
-                <w:sz w:val="16"/>
-                <w:szCs w:val="16"/>
-              </w:rPr>
-              <w:t xml:space="preserve"> Demolition of load-bearing structure</w:t>
+              <w:t>[   ] Demolition of load-bearing structure</w:t>
             </w:r>
           </w:p>
         </w:tc>
@@ -1053,25 +804,7 @@
                 <w:sz w:val="16"/>
                 <w:szCs w:val="16"/>
               </w:rPr>
-              <w:t xml:space="preserve">[ </w:t>
-            </w:r>
-            <w:proofErr w:type="gramStart"/>
-            <w:r>
-              <w:rPr>
-                <w:rFonts w:ascii="Aptos" w:hAnsi="Aptos" w:cstheme="majorHAnsi"/>
-                <w:sz w:val="16"/>
-                <w:szCs w:val="16"/>
-              </w:rPr>
-              <w:t xml:space="preserve">  ]</w:t>
-            </w:r>
-            <w:proofErr w:type="gramEnd"/>
-            <w:r>
-              <w:rPr>
-                <w:rFonts w:ascii="Aptos" w:hAnsi="Aptos" w:cstheme="majorHAnsi"/>
-                <w:sz w:val="16"/>
-                <w:szCs w:val="16"/>
-              </w:rPr>
-              <w:t xml:space="preserve"> Likely to involve disturbing asbestos</w:t>
+              <w:t>[   ] Likely to involve disturbing asbestos</w:t>
             </w:r>
           </w:p>
         </w:tc>
@@ -1096,25 +829,7 @@
                 <w:sz w:val="16"/>
                 <w:szCs w:val="16"/>
               </w:rPr>
-              <w:t xml:space="preserve">[ </w:t>
-            </w:r>
-            <w:proofErr w:type="gramStart"/>
-            <w:r>
-              <w:rPr>
-                <w:rFonts w:ascii="Aptos" w:hAnsi="Aptos" w:cstheme="majorHAnsi"/>
-                <w:sz w:val="16"/>
-                <w:szCs w:val="16"/>
-              </w:rPr>
-              <w:t xml:space="preserve">  ]</w:t>
-            </w:r>
-            <w:proofErr w:type="gramEnd"/>
-            <w:r>
-              <w:rPr>
-                <w:rFonts w:ascii="Aptos" w:hAnsi="Aptos" w:cstheme="majorHAnsi"/>
-                <w:sz w:val="16"/>
-                <w:szCs w:val="16"/>
-              </w:rPr>
-              <w:t xml:space="preserve"> Temporary load-bearing support for structural alterations or repairs</w:t>
+              <w:t>[   ] Temporary load-bearing support for structural alterations or repairs</w:t>
             </w:r>
           </w:p>
         </w:tc>
@@ -1139,25 +854,7 @@
                 <w:sz w:val="16"/>
                 <w:szCs w:val="16"/>
               </w:rPr>
-              <w:t xml:space="preserve">[ </w:t>
-            </w:r>
-            <w:proofErr w:type="gramStart"/>
-            <w:r>
-              <w:rPr>
-                <w:rFonts w:ascii="Aptos" w:hAnsi="Aptos" w:cstheme="majorHAnsi"/>
-                <w:sz w:val="16"/>
-                <w:szCs w:val="16"/>
-              </w:rPr>
-              <w:t xml:space="preserve">  ]</w:t>
-            </w:r>
-            <w:proofErr w:type="gramEnd"/>
-            <w:r>
-              <w:rPr>
-                <w:rFonts w:ascii="Aptos" w:hAnsi="Aptos" w:cstheme="majorHAnsi"/>
-                <w:sz w:val="16"/>
-                <w:szCs w:val="16"/>
-              </w:rPr>
-              <w:t xml:space="preserve"> Work in or near a confined space</w:t>
+              <w:t>[   ] Work in or near a confined space</w:t>
             </w:r>
           </w:p>
         </w:tc>
@@ -1211,25 +908,7 @@
                 <w:sz w:val="16"/>
                 <w:szCs w:val="16"/>
               </w:rPr>
-              <w:t xml:space="preserve">[ </w:t>
-            </w:r>
-            <w:proofErr w:type="gramStart"/>
-            <w:r>
-              <w:rPr>
-                <w:rFonts w:ascii="Aptos" w:hAnsi="Aptos" w:cstheme="majorHAnsi"/>
-                <w:sz w:val="16"/>
-                <w:szCs w:val="16"/>
-              </w:rPr>
-              <w:t xml:space="preserve">  ]</w:t>
-            </w:r>
-            <w:proofErr w:type="gramEnd"/>
-            <w:r>
-              <w:rPr>
-                <w:rFonts w:ascii="Aptos" w:hAnsi="Aptos" w:cstheme="majorHAnsi"/>
-                <w:sz w:val="16"/>
-                <w:szCs w:val="16"/>
-              </w:rPr>
-              <w:t xml:space="preserve"> Work in or near a shaft or trench deeper than 1.5 m or a tunnel</w:t>
+              <w:t>[   ] Work in or near a shaft or trench deeper than 1.5 m or a tunnel</w:t>
             </w:r>
           </w:p>
         </w:tc>
@@ -1254,25 +933,7 @@
                 <w:sz w:val="16"/>
                 <w:szCs w:val="16"/>
               </w:rPr>
-              <w:t xml:space="preserve">[ </w:t>
-            </w:r>
-            <w:proofErr w:type="gramStart"/>
-            <w:r>
-              <w:rPr>
-                <w:rFonts w:ascii="Aptos" w:hAnsi="Aptos" w:cstheme="majorHAnsi"/>
-                <w:sz w:val="16"/>
-                <w:szCs w:val="16"/>
-              </w:rPr>
-              <w:t xml:space="preserve">  ]</w:t>
-            </w:r>
-            <w:proofErr w:type="gramEnd"/>
-            <w:r>
-              <w:rPr>
-                <w:rFonts w:ascii="Aptos" w:hAnsi="Aptos" w:cstheme="majorHAnsi"/>
-                <w:sz w:val="16"/>
-                <w:szCs w:val="16"/>
-              </w:rPr>
-              <w:t xml:space="preserve"> Use of explosives</w:t>
+              <w:t>[   ] Use of explosives</w:t>
             </w:r>
           </w:p>
         </w:tc>
@@ -1297,25 +958,7 @@
                 <w:sz w:val="16"/>
                 <w:szCs w:val="16"/>
               </w:rPr>
-              <w:t xml:space="preserve">[ </w:t>
-            </w:r>
-            <w:proofErr w:type="gramStart"/>
-            <w:r>
-              <w:rPr>
-                <w:rFonts w:ascii="Aptos" w:hAnsi="Aptos" w:cstheme="majorHAnsi"/>
-                <w:sz w:val="16"/>
-                <w:szCs w:val="16"/>
-              </w:rPr>
-              <w:t xml:space="preserve">  ]</w:t>
-            </w:r>
-            <w:proofErr w:type="gramEnd"/>
-            <w:r>
-              <w:rPr>
-                <w:rFonts w:ascii="Aptos" w:hAnsi="Aptos" w:cstheme="majorHAnsi"/>
-                <w:sz w:val="16"/>
-                <w:szCs w:val="16"/>
-              </w:rPr>
-              <w:t xml:space="preserve"> Work on or near pressurised gas mains or piping</w:t>
+              <w:t>[   ] Work on or near pressurised gas mains or piping</w:t>
             </w:r>
           </w:p>
         </w:tc>
@@ -1369,25 +1012,7 @@
                 <w:sz w:val="16"/>
                 <w:szCs w:val="16"/>
               </w:rPr>
-              <w:t xml:space="preserve">[ </w:t>
-            </w:r>
-            <w:proofErr w:type="gramStart"/>
-            <w:r>
-              <w:rPr>
-                <w:rFonts w:ascii="Aptos" w:hAnsi="Aptos" w:cstheme="majorHAnsi"/>
-                <w:sz w:val="16"/>
-                <w:szCs w:val="16"/>
-              </w:rPr>
-              <w:t xml:space="preserve">  ]</w:t>
-            </w:r>
-            <w:proofErr w:type="gramEnd"/>
-            <w:r>
-              <w:rPr>
-                <w:rFonts w:ascii="Aptos" w:hAnsi="Aptos" w:cstheme="majorHAnsi"/>
-                <w:sz w:val="16"/>
-                <w:szCs w:val="16"/>
-              </w:rPr>
-              <w:t xml:space="preserve"> Work on or near chemical, fuel or refrigerant lines</w:t>
+              <w:t>[   ] Work on or near chemical, fuel or refrigerant lines</w:t>
             </w:r>
           </w:p>
         </w:tc>
@@ -1412,25 +1037,7 @@
                 <w:sz w:val="16"/>
                 <w:szCs w:val="16"/>
               </w:rPr>
-              <w:t xml:space="preserve">[ </w:t>
-            </w:r>
-            <w:proofErr w:type="gramStart"/>
-            <w:r>
-              <w:rPr>
-                <w:rFonts w:ascii="Aptos" w:hAnsi="Aptos" w:cstheme="majorHAnsi"/>
-                <w:sz w:val="16"/>
-                <w:szCs w:val="16"/>
-              </w:rPr>
-              <w:t xml:space="preserve">  ]</w:t>
-            </w:r>
-            <w:proofErr w:type="gramEnd"/>
-            <w:r>
-              <w:rPr>
-                <w:rFonts w:ascii="Aptos" w:hAnsi="Aptos" w:cstheme="majorHAnsi"/>
-                <w:sz w:val="16"/>
-                <w:szCs w:val="16"/>
-              </w:rPr>
-              <w:t xml:space="preserve"> Work on or near energised electrical installations or services</w:t>
+              <w:t>[   ] Work on or near energised electrical installations or services</w:t>
             </w:r>
           </w:p>
         </w:tc>
@@ -1455,25 +1062,7 @@
                 <w:sz w:val="16"/>
                 <w:szCs w:val="16"/>
               </w:rPr>
-              <w:t xml:space="preserve">[ </w:t>
-            </w:r>
-            <w:proofErr w:type="gramStart"/>
-            <w:r>
-              <w:rPr>
-                <w:rFonts w:ascii="Aptos" w:hAnsi="Aptos" w:cstheme="majorHAnsi"/>
-                <w:sz w:val="16"/>
-                <w:szCs w:val="16"/>
-              </w:rPr>
-              <w:t xml:space="preserve">  ]</w:t>
-            </w:r>
-            <w:proofErr w:type="gramEnd"/>
-            <w:r>
-              <w:rPr>
-                <w:rFonts w:ascii="Aptos" w:hAnsi="Aptos" w:cstheme="majorHAnsi"/>
-                <w:sz w:val="16"/>
-                <w:szCs w:val="16"/>
-              </w:rPr>
-              <w:t xml:space="preserve"> Work in an area that may have a contaminated or flammable atmosphere</w:t>
+              <w:t>[   ] Work in an area that may have a contaminated or flammable atmosphere</w:t>
             </w:r>
           </w:p>
         </w:tc>
@@ -1527,25 +1116,7 @@
                 <w:sz w:val="16"/>
                 <w:szCs w:val="16"/>
               </w:rPr>
-              <w:t xml:space="preserve">[ </w:t>
-            </w:r>
-            <w:proofErr w:type="gramStart"/>
-            <w:r>
-              <w:rPr>
-                <w:rFonts w:ascii="Aptos" w:hAnsi="Aptos" w:cstheme="majorHAnsi"/>
-                <w:sz w:val="16"/>
-                <w:szCs w:val="16"/>
-              </w:rPr>
-              <w:t xml:space="preserve">  ]</w:t>
-            </w:r>
-            <w:proofErr w:type="gramEnd"/>
-            <w:r>
-              <w:rPr>
-                <w:rFonts w:ascii="Aptos" w:hAnsi="Aptos" w:cstheme="majorHAnsi"/>
-                <w:sz w:val="16"/>
-                <w:szCs w:val="16"/>
-              </w:rPr>
-              <w:t xml:space="preserve"> Tilt-up or precast concrete elements</w:t>
+              <w:t>[   ] Tilt-up or precast concrete elements</w:t>
             </w:r>
           </w:p>
         </w:tc>
@@ -1570,25 +1141,7 @@
                 <w:sz w:val="16"/>
                 <w:szCs w:val="16"/>
               </w:rPr>
-              <w:t xml:space="preserve">[ </w:t>
-            </w:r>
-            <w:proofErr w:type="gramStart"/>
-            <w:r>
-              <w:rPr>
-                <w:rFonts w:ascii="Aptos" w:hAnsi="Aptos" w:cstheme="majorHAnsi"/>
-                <w:sz w:val="16"/>
-                <w:szCs w:val="16"/>
-              </w:rPr>
-              <w:t xml:space="preserve">  ]</w:t>
-            </w:r>
-            <w:proofErr w:type="gramEnd"/>
-            <w:r>
-              <w:rPr>
-                <w:rFonts w:ascii="Aptos" w:hAnsi="Aptos" w:cstheme="majorHAnsi"/>
-                <w:sz w:val="16"/>
-                <w:szCs w:val="16"/>
-              </w:rPr>
-              <w:t xml:space="preserve"> Work on, in or adjacent to a road, railway, shipping lane or other traffic corridor in use by traffic other than pedestrians</w:t>
+              <w:t>[   ] Work on, in or adjacent to a road, railway, shipping lane or other traffic corridor in use by traffic other than pedestrians</w:t>
             </w:r>
           </w:p>
         </w:tc>
@@ -1620,15 +1173,7 @@
                 <w:rFonts w:ascii="Aptos" w:hAnsi="Aptos" w:cs="Aptos"/>
                 <w:sz w:val="16"/>
               </w:rPr>
-              <w:t xml:space="preserve"> </w:t>
-            </w:r>
-            <w:proofErr w:type="gramStart"/>
-            <w:r>
-              <w:rPr>
-                <w:rFonts w:ascii="Aptos" w:hAnsi="Aptos" w:cs="Aptos"/>
-                <w:sz w:val="16"/>
-              </w:rPr>
-              <w:t xml:space="preserve">  </w:t>
+              <w:t xml:space="preserve">   </w:t>
             </w:r>
             <w:r>
               <w:rPr>
@@ -1636,16 +1181,7 @@
                 <w:sz w:val="16"/>
                 <w:szCs w:val="16"/>
               </w:rPr>
-              <w:t>]</w:t>
-            </w:r>
-            <w:proofErr w:type="gramEnd"/>
-            <w:r>
-              <w:rPr>
-                <w:rFonts w:ascii="Aptos" w:hAnsi="Aptos" w:cstheme="majorHAnsi"/>
-                <w:sz w:val="16"/>
-                <w:szCs w:val="16"/>
-              </w:rPr>
-              <w:t xml:space="preserve"> Work in an area with movement of powered mobile plant</w:t>
+              <w:t>] Work in an area with movement of powered mobile plant</w:t>
             </w:r>
           </w:p>
         </w:tc>
@@ -1699,25 +1235,7 @@
                 <w:sz w:val="16"/>
                 <w:szCs w:val="16"/>
               </w:rPr>
-              <w:t xml:space="preserve">[ </w:t>
-            </w:r>
-            <w:proofErr w:type="gramStart"/>
-            <w:r>
-              <w:rPr>
-                <w:rFonts w:ascii="Aptos" w:hAnsi="Aptos" w:cstheme="majorHAnsi"/>
-                <w:sz w:val="16"/>
-                <w:szCs w:val="16"/>
-              </w:rPr>
-              <w:t xml:space="preserve">  ]</w:t>
-            </w:r>
-            <w:proofErr w:type="gramEnd"/>
-            <w:r>
-              <w:rPr>
-                <w:rFonts w:ascii="Aptos" w:hAnsi="Aptos" w:cstheme="majorHAnsi"/>
-                <w:sz w:val="16"/>
-                <w:szCs w:val="16"/>
-              </w:rPr>
-              <w:t xml:space="preserve"> Work in areas with artificial extremes of temperature</w:t>
+              <w:t>[   ] Work in areas with artificial extremes of temperature</w:t>
             </w:r>
           </w:p>
         </w:tc>
@@ -1742,25 +1260,7 @@
                 <w:sz w:val="16"/>
                 <w:szCs w:val="16"/>
               </w:rPr>
-              <w:t xml:space="preserve">[ </w:t>
-            </w:r>
-            <w:proofErr w:type="gramStart"/>
-            <w:r>
-              <w:rPr>
-                <w:rFonts w:ascii="Aptos" w:hAnsi="Aptos" w:cstheme="majorHAnsi"/>
-                <w:sz w:val="16"/>
-                <w:szCs w:val="16"/>
-              </w:rPr>
-              <w:t xml:space="preserve">  ]</w:t>
-            </w:r>
-            <w:proofErr w:type="gramEnd"/>
-            <w:r>
-              <w:rPr>
-                <w:rFonts w:ascii="Aptos" w:hAnsi="Aptos" w:cstheme="majorHAnsi"/>
-                <w:sz w:val="16"/>
-                <w:szCs w:val="16"/>
-              </w:rPr>
-              <w:t xml:space="preserve"> Work in or near water or other liquid that involves a risk of drowning</w:t>
+              <w:t>[   ] Work in or near water or other liquid that involves a risk of drowning</w:t>
             </w:r>
           </w:p>
         </w:tc>
@@ -1785,25 +1285,7 @@
                 <w:sz w:val="16"/>
                 <w:szCs w:val="16"/>
               </w:rPr>
-              <w:t xml:space="preserve">[ </w:t>
-            </w:r>
-            <w:proofErr w:type="gramStart"/>
-            <w:r>
-              <w:rPr>
-                <w:rFonts w:ascii="Aptos" w:hAnsi="Aptos" w:cstheme="majorHAnsi"/>
-                <w:sz w:val="16"/>
-                <w:szCs w:val="16"/>
-              </w:rPr>
-              <w:t xml:space="preserve">  ]</w:t>
-            </w:r>
-            <w:proofErr w:type="gramEnd"/>
-            <w:r>
-              <w:rPr>
-                <w:rFonts w:ascii="Aptos" w:hAnsi="Aptos" w:cstheme="majorHAnsi"/>
-                <w:sz w:val="16"/>
-                <w:szCs w:val="16"/>
-              </w:rPr>
-              <w:t xml:space="preserve"> Diving work</w:t>
+              <w:t>[   ] Diving work</w:t>
             </w:r>
           </w:p>
         </w:tc>
@@ -1839,17 +1321,7 @@
                 <w:sz w:val="18"/>
                 <w:szCs w:val="18"/>
               </w:rPr>
-              <w:t>Person responsible for ensuring compliance with SWMS</w:t>
-            </w:r>
-            <w:r>
-              <w:rPr>
-                <w:rFonts w:ascii="Aptos" w:hAnsi="Aptos"/>
-                <w:b/>
-                <w:bCs/>
-                <w:sz w:val="18"/>
-                <w:szCs w:val="18"/>
-              </w:rPr>
-              <w:t>?</w:t>
+              <w:t>Person responsible for ensuring compliance with SWMS?</w:t>
             </w:r>
           </w:p>
         </w:tc>
@@ -1897,20 +1369,7 @@
                 <w:szCs w:val="16"/>
                 <w:highlight w:val="yellow"/>
               </w:rPr>
-              <w:t>Supervisor</w:t>
-            </w:r>
-            <w:r>
-              <w:rPr>
-                <w:rFonts w:ascii="Aptos" w:hAnsi="Aptos"/>
-                <w:b/>
-                <w:bCs/>
-                <w:i/>
-                <w:iCs/>
-                <w:sz w:val="16"/>
-                <w:szCs w:val="16"/>
-                <w:highlight w:val="yellow"/>
-              </w:rPr>
-              <w:t xml:space="preserve"> </w:t>
+              <w:t xml:space="preserve">Supervisor </w:t>
             </w:r>
             <w:r>
               <w:rPr>
@@ -1921,7 +1380,584 @@
                 <w:sz w:val="18"/>
                 <w:szCs w:val="18"/>
               </w:rPr>
-              <w:t xml:space="preserve">[Insert </w:t>
+              <w:t>[Insert Supervisor name here]</w:t>
+            </w:r>
+          </w:p>
+        </w:tc>
+        <w:tc>
+          <w:tcPr>
+            <w:tcW w:w="1984" w:type="dxa"/>
+            <w:shd w:val="clear" w:color="auto" w:fill="DBE5F1"/>
+          </w:tcPr>
+          <w:p>
+            <w:pPr>
+              <w:spacing w:before="80" w:after="80"/>
+              <w:jc w:val="right"/>
+              <w:rPr>
+                <w:rFonts w:ascii="Aptos" w:hAnsi="Aptos"/>
+                <w:sz w:val="16"/>
+                <w:szCs w:val="16"/>
+                <w:highlight w:val="yellow"/>
+              </w:rPr>
+            </w:pPr>
+            <w:r>
+              <w:rPr>
+                <w:rFonts w:ascii="Aptos" w:hAnsi="Aptos"/>
+                <w:b/>
+                <w:bCs/>
+                <w:sz w:val="16"/>
+                <w:szCs w:val="16"/>
+              </w:rPr>
+              <w:t>Date SWMS received:</w:t>
+            </w:r>
+          </w:p>
+        </w:tc>
+        <w:tc>
+          <w:tcPr>
+            <w:tcW w:w="4678" w:type="dxa"/>
+            <w:gridSpan w:val="2"/>
+          </w:tcPr>
+          <w:p>
+            <w:pPr>
+              <w:spacing w:before="60" w:after="60"/>
+              <w:rPr>
+                <w:rFonts w:ascii="Aptos" w:hAnsi="Aptos"/>
+                <w:i/>
+                <w:iCs/>
+                <w:sz w:val="16"/>
+                <w:szCs w:val="16"/>
+                <w:highlight w:val="yellow"/>
+              </w:rPr>
+            </w:pPr>
+            <w:r>
+              <w:rPr>
+                <w:rFonts w:ascii="Aptos" w:hAnsi="Aptos"/>
+                <w:i/>
+                <w:iCs/>
+                <w:sz w:val="16"/>
+                <w:szCs w:val="16"/>
+              </w:rPr>
+              <w:t>■</w:t>
+            </w:r>
+            <w:r>
+              <w:rPr>
+                <w:rFonts w:ascii="Aptos" w:hAnsi="Aptos" w:cstheme="majorHAnsi"/>
+                <w:i/>
+                <w:iCs/>
+                <w:sz w:val="16"/>
+                <w:szCs w:val="16"/>
+              </w:rPr>
+              <w:t xml:space="preserve"> </w:t>
+            </w:r>
+            <w:r>
+              <w:rPr>
+                <w:rFonts w:ascii="Aptos" w:hAnsi="Aptos" w:cstheme="majorHAnsi"/>
+                <w:b/>
+                <w:i/>
+                <w:iCs/>
+                <w:sz w:val="16"/>
+                <w:szCs w:val="16"/>
+              </w:rPr>
+              <w:t>Date:</w:t>
+            </w:r>
+            <w:r>
+              <w:rPr>
+                <w:rFonts w:ascii="Aptos" w:hAnsi="Aptos" w:cstheme="majorHAnsi"/>
+                <w:i/>
+                <w:iCs/>
+                <w:sz w:val="16"/>
+                <w:szCs w:val="16"/>
+              </w:rPr>
+              <w:t xml:space="preserve"> </w:t>
+            </w:r>
+            <w:r>
+              <w:rPr>
+                <w:rFonts w:ascii="Aptos" w:hAnsi="Aptos" w:cstheme="majorHAnsi"/>
+                <w:i/>
+                <w:iCs/>
+                <w:color w:val="444444"/>
+                <w:sz w:val="16"/>
+                <w:szCs w:val="16"/>
+              </w:rPr>
+              <w:t>[Insert Date Here]</w:t>
+            </w:r>
+          </w:p>
+        </w:tc>
+      </w:tr>
+      <w:tr>
+        <w:trPr>
+          <w:cantSplit/>
+        </w:trPr>
+        <w:tc>
+          <w:tcPr>
+            <w:tcW w:w="4531" w:type="dxa"/>
+            <w:gridSpan w:val="2"/>
+            <w:shd w:val="clear" w:color="auto" w:fill="DBE5F1"/>
+          </w:tcPr>
+          <w:p>
+            <w:pPr>
+              <w:jc w:val="right"/>
+              <w:rPr>
+                <w:rFonts w:ascii="Aptos" w:hAnsi="Aptos"/>
+                <w:b/>
+                <w:bCs/>
+                <w:sz w:val="18"/>
+                <w:szCs w:val="18"/>
+              </w:rPr>
+            </w:pPr>
+            <w:r>
+              <w:rPr>
+                <w:rFonts w:ascii="Aptos" w:hAnsi="Aptos"/>
+                <w:b/>
+                <w:bCs/>
+                <w:sz w:val="18"/>
+                <w:szCs w:val="18"/>
+              </w:rPr>
+              <w:t>What measures are in place to ensure compliance with the SWMS?</w:t>
+            </w:r>
+          </w:p>
+        </w:tc>
+        <w:tc>
+          <w:tcPr>
+            <w:tcW w:w="10915" w:type="dxa"/>
+            <w:gridSpan w:val="5"/>
+          </w:tcPr>
+          <w:p>
+            <w:pPr>
+              <w:spacing w:line="240" w:lineRule="auto"/>
+              <w:rPr>
+                <w:rFonts w:ascii="Aptos" w:hAnsi="Aptos"/>
+                <w:sz w:val="16"/>
+                <w:szCs w:val="16"/>
+                <w:highlight w:val="yellow"/>
+              </w:rPr>
+            </w:pPr>
+            <w:r>
+              <w:rPr>
+                <w:rFonts w:ascii="Aptos" w:hAnsi="Aptos"/>
+                <w:sz w:val="16"/>
+                <w:szCs w:val="16"/>
+              </w:rPr>
+              <w:t>Toolbox</w:t>
+            </w:r>
+            <w:r>
+              <w:rPr>
+                <w:rFonts w:ascii="Aptos" w:hAnsi="Aptos"/>
+                <w:spacing w:val="-1"/>
+                <w:sz w:val="16"/>
+                <w:szCs w:val="16"/>
+              </w:rPr>
+              <w:t xml:space="preserve"> </w:t>
+            </w:r>
+            <w:r>
+              <w:rPr>
+                <w:rFonts w:ascii="Aptos" w:hAnsi="Aptos"/>
+                <w:sz w:val="16"/>
+                <w:szCs w:val="16"/>
+              </w:rPr>
+              <w:t>meetings,</w:t>
+            </w:r>
+            <w:r>
+              <w:rPr>
+                <w:rFonts w:ascii="Aptos" w:hAnsi="Aptos"/>
+                <w:spacing w:val="-4"/>
+                <w:sz w:val="16"/>
+                <w:szCs w:val="16"/>
+              </w:rPr>
+              <w:t xml:space="preserve"> </w:t>
+            </w:r>
+            <w:r>
+              <w:rPr>
+                <w:rFonts w:ascii="Aptos" w:hAnsi="Aptos"/>
+                <w:sz w:val="16"/>
+                <w:szCs w:val="16"/>
+              </w:rPr>
+              <w:t>SWMS</w:t>
+            </w:r>
+            <w:r>
+              <w:rPr>
+                <w:rFonts w:ascii="Aptos" w:hAnsi="Aptos"/>
+                <w:spacing w:val="-3"/>
+                <w:sz w:val="16"/>
+                <w:szCs w:val="16"/>
+              </w:rPr>
+              <w:t xml:space="preserve"> </w:t>
+            </w:r>
+            <w:r>
+              <w:rPr>
+                <w:rFonts w:ascii="Aptos" w:hAnsi="Aptos"/>
+                <w:sz w:val="16"/>
+                <w:szCs w:val="16"/>
+              </w:rPr>
+              <w:t>sign</w:t>
+            </w:r>
+            <w:r>
+              <w:rPr>
+                <w:rFonts w:ascii="Aptos" w:hAnsi="Aptos"/>
+                <w:spacing w:val="-5"/>
+                <w:sz w:val="16"/>
+                <w:szCs w:val="16"/>
+              </w:rPr>
+              <w:t xml:space="preserve"> </w:t>
+            </w:r>
+            <w:r>
+              <w:rPr>
+                <w:rFonts w:ascii="Aptos" w:hAnsi="Aptos"/>
+                <w:sz w:val="16"/>
+                <w:szCs w:val="16"/>
+              </w:rPr>
+              <w:t>off,</w:t>
+            </w:r>
+            <w:r>
+              <w:rPr>
+                <w:rFonts w:ascii="Aptos" w:hAnsi="Aptos"/>
+                <w:spacing w:val="-1"/>
+                <w:sz w:val="16"/>
+                <w:szCs w:val="16"/>
+              </w:rPr>
+              <w:t xml:space="preserve"> </w:t>
+            </w:r>
+            <w:r>
+              <w:rPr>
+                <w:rFonts w:ascii="Aptos" w:hAnsi="Aptos"/>
+                <w:sz w:val="16"/>
+                <w:szCs w:val="16"/>
+              </w:rPr>
+              <w:t>job</w:t>
+            </w:r>
+            <w:r>
+              <w:rPr>
+                <w:rFonts w:ascii="Aptos" w:hAnsi="Aptos"/>
+                <w:spacing w:val="-3"/>
+                <w:sz w:val="16"/>
+                <w:szCs w:val="16"/>
+              </w:rPr>
+              <w:t xml:space="preserve"> </w:t>
+            </w:r>
+            <w:r>
+              <w:rPr>
+                <w:rFonts w:ascii="Aptos" w:hAnsi="Aptos"/>
+                <w:sz w:val="16"/>
+                <w:szCs w:val="16"/>
+              </w:rPr>
+              <w:t>observations</w:t>
+            </w:r>
+            <w:r>
+              <w:rPr>
+                <w:rFonts w:ascii="Aptos" w:hAnsi="Aptos"/>
+                <w:spacing w:val="-3"/>
+                <w:sz w:val="16"/>
+                <w:szCs w:val="16"/>
+              </w:rPr>
+              <w:t xml:space="preserve"> </w:t>
+            </w:r>
+            <w:r>
+              <w:rPr>
+                <w:rFonts w:ascii="Aptos" w:hAnsi="Aptos"/>
+                <w:sz w:val="16"/>
+                <w:szCs w:val="16"/>
+              </w:rPr>
+              <w:t>and</w:t>
+            </w:r>
+            <w:r>
+              <w:rPr>
+                <w:rFonts w:ascii="Aptos" w:hAnsi="Aptos"/>
+                <w:spacing w:val="-3"/>
+                <w:sz w:val="16"/>
+                <w:szCs w:val="16"/>
+              </w:rPr>
+              <w:t xml:space="preserve"> </w:t>
+            </w:r>
+            <w:r>
+              <w:rPr>
+                <w:rFonts w:ascii="Aptos" w:hAnsi="Aptos"/>
+                <w:sz w:val="16"/>
+                <w:szCs w:val="16"/>
+              </w:rPr>
+              <w:t>supervision</w:t>
+            </w:r>
+            <w:r>
+              <w:rPr>
+                <w:rFonts w:ascii="Aptos" w:hAnsi="Aptos"/>
+                <w:spacing w:val="-3"/>
+                <w:sz w:val="16"/>
+                <w:szCs w:val="16"/>
+              </w:rPr>
+              <w:t xml:space="preserve"> </w:t>
+            </w:r>
+            <w:r>
+              <w:rPr>
+                <w:rFonts w:ascii="Aptos" w:hAnsi="Aptos"/>
+                <w:sz w:val="16"/>
+                <w:szCs w:val="16"/>
+              </w:rPr>
+              <w:t>review.</w:t>
+            </w:r>
+            <w:r>
+              <w:rPr>
+                <w:rFonts w:ascii="Aptos" w:hAnsi="Aptos"/>
+                <w:spacing w:val="-4"/>
+                <w:sz w:val="16"/>
+                <w:szCs w:val="16"/>
+              </w:rPr>
+              <w:t xml:space="preserve"> </w:t>
+            </w:r>
+            <w:r>
+              <w:rPr>
+                <w:rFonts w:ascii="Aptos" w:hAnsi="Aptos"/>
+                <w:sz w:val="16"/>
+                <w:szCs w:val="16"/>
+              </w:rPr>
+              <w:t>If</w:t>
+            </w:r>
+            <w:r>
+              <w:rPr>
+                <w:rFonts w:ascii="Aptos" w:hAnsi="Aptos"/>
+                <w:spacing w:val="-4"/>
+                <w:sz w:val="16"/>
+                <w:szCs w:val="16"/>
+              </w:rPr>
+              <w:t xml:space="preserve"> </w:t>
+            </w:r>
+            <w:r>
+              <w:rPr>
+                <w:rFonts w:ascii="Aptos" w:hAnsi="Aptos"/>
+                <w:sz w:val="16"/>
+                <w:szCs w:val="16"/>
+              </w:rPr>
+              <w:t>issues</w:t>
+            </w:r>
+            <w:r>
+              <w:rPr>
+                <w:rFonts w:ascii="Aptos" w:hAnsi="Aptos"/>
+                <w:spacing w:val="-3"/>
+                <w:sz w:val="16"/>
+                <w:szCs w:val="16"/>
+              </w:rPr>
+              <w:t xml:space="preserve"> </w:t>
+            </w:r>
+            <w:r>
+              <w:rPr>
+                <w:rFonts w:ascii="Aptos" w:hAnsi="Aptos"/>
+                <w:sz w:val="16"/>
+                <w:szCs w:val="16"/>
+              </w:rPr>
+              <w:t>with</w:t>
+            </w:r>
+            <w:r>
+              <w:rPr>
+                <w:rFonts w:ascii="Aptos" w:hAnsi="Aptos"/>
+                <w:spacing w:val="-1"/>
+                <w:sz w:val="16"/>
+                <w:szCs w:val="16"/>
+              </w:rPr>
+              <w:t xml:space="preserve"> </w:t>
+            </w:r>
+            <w:r>
+              <w:rPr>
+                <w:rFonts w:ascii="Aptos" w:hAnsi="Aptos"/>
+                <w:sz w:val="16"/>
+                <w:szCs w:val="16"/>
+              </w:rPr>
+              <w:t>the</w:t>
+            </w:r>
+            <w:r>
+              <w:rPr>
+                <w:rFonts w:ascii="Aptos" w:hAnsi="Aptos"/>
+                <w:spacing w:val="-1"/>
+                <w:sz w:val="16"/>
+                <w:szCs w:val="16"/>
+              </w:rPr>
+              <w:t xml:space="preserve"> </w:t>
+            </w:r>
+            <w:r>
+              <w:rPr>
+                <w:rFonts w:ascii="Aptos" w:hAnsi="Aptos"/>
+                <w:sz w:val="16"/>
+                <w:szCs w:val="16"/>
+              </w:rPr>
+              <w:t>SWMS</w:t>
+            </w:r>
+            <w:r>
+              <w:rPr>
+                <w:rFonts w:ascii="Aptos" w:hAnsi="Aptos"/>
+                <w:spacing w:val="-3"/>
+                <w:sz w:val="16"/>
+                <w:szCs w:val="16"/>
+              </w:rPr>
+              <w:t xml:space="preserve"> </w:t>
+            </w:r>
+            <w:r>
+              <w:rPr>
+                <w:rFonts w:ascii="Aptos" w:hAnsi="Aptos"/>
+                <w:sz w:val="16"/>
+                <w:szCs w:val="16"/>
+              </w:rPr>
+              <w:t>or</w:t>
+            </w:r>
+            <w:r>
+              <w:rPr>
+                <w:rFonts w:ascii="Aptos" w:hAnsi="Aptos"/>
+                <w:spacing w:val="-3"/>
+                <w:sz w:val="16"/>
+                <w:szCs w:val="16"/>
+              </w:rPr>
+              <w:t xml:space="preserve"> </w:t>
+            </w:r>
+            <w:r>
+              <w:rPr>
+                <w:rFonts w:ascii="Aptos" w:hAnsi="Aptos"/>
+                <w:sz w:val="16"/>
+                <w:szCs w:val="16"/>
+              </w:rPr>
+              <w:t>new</w:t>
+            </w:r>
+            <w:r>
+              <w:rPr>
+                <w:rFonts w:ascii="Aptos" w:hAnsi="Aptos"/>
+                <w:spacing w:val="-5"/>
+                <w:sz w:val="16"/>
+                <w:szCs w:val="16"/>
+              </w:rPr>
+              <w:t xml:space="preserve"> </w:t>
+            </w:r>
+            <w:r>
+              <w:rPr>
+                <w:rFonts w:ascii="Aptos" w:hAnsi="Aptos"/>
+                <w:sz w:val="16"/>
+                <w:szCs w:val="16"/>
+              </w:rPr>
+              <w:t>hazards</w:t>
+            </w:r>
+            <w:r>
+              <w:rPr>
+                <w:rFonts w:ascii="Aptos" w:hAnsi="Aptos"/>
+                <w:spacing w:val="-3"/>
+                <w:sz w:val="16"/>
+                <w:szCs w:val="16"/>
+              </w:rPr>
+              <w:t xml:space="preserve"> </w:t>
+            </w:r>
+            <w:r>
+              <w:rPr>
+                <w:rFonts w:ascii="Aptos" w:hAnsi="Aptos"/>
+                <w:sz w:val="16"/>
+                <w:szCs w:val="16"/>
+              </w:rPr>
+              <w:t>are identified,</w:t>
+            </w:r>
+            <w:r>
+              <w:rPr>
+                <w:rFonts w:ascii="Aptos" w:hAnsi="Aptos"/>
+                <w:spacing w:val="-1"/>
+                <w:sz w:val="16"/>
+                <w:szCs w:val="16"/>
+              </w:rPr>
+              <w:t xml:space="preserve"> </w:t>
+            </w:r>
+            <w:r>
+              <w:rPr>
+                <w:rFonts w:ascii="Aptos" w:hAnsi="Aptos"/>
+                <w:sz w:val="16"/>
+                <w:szCs w:val="16"/>
+              </w:rPr>
+              <w:t>the supervisor must be notified. When changes are made to SWMS, it will be communicated to all workers.</w:t>
+            </w:r>
+          </w:p>
+        </w:tc>
+      </w:tr>
+      <w:tr>
+        <w:trPr>
+          <w:cantSplit/>
+          <w:trHeight w:val="391"/>
+        </w:trPr>
+        <w:tc>
+          <w:tcPr>
+            <w:tcW w:w="4531" w:type="dxa"/>
+            <w:gridSpan w:val="2"/>
+            <w:shd w:val="clear" w:color="auto" w:fill="DBE5F1"/>
+          </w:tcPr>
+          <w:p>
+            <w:pPr>
+              <w:spacing w:before="80" w:after="80"/>
+              <w:jc w:val="right"/>
+              <w:rPr>
+                <w:rFonts w:ascii="Aptos" w:hAnsi="Aptos"/>
+                <w:b/>
+                <w:bCs/>
+                <w:sz w:val="18"/>
+                <w:szCs w:val="18"/>
+              </w:rPr>
+            </w:pPr>
+            <w:r>
+              <w:rPr>
+                <w:rFonts w:ascii="Aptos" w:hAnsi="Aptos"/>
+                <w:b/>
+                <w:bCs/>
+                <w:sz w:val="18"/>
+                <w:szCs w:val="18"/>
+              </w:rPr>
+              <w:t>Person responsible for reviewing SWMS control measures?</w:t>
+            </w:r>
+          </w:p>
+        </w:tc>
+        <w:tc>
+          <w:tcPr>
+            <w:tcW w:w="4253" w:type="dxa"/>
+            <w:gridSpan w:val="2"/>
+          </w:tcPr>
+          <w:p>
+            <w:pPr>
+              <w:spacing w:before="60" w:after="60"/>
+              <w:rPr>
+                <w:rFonts w:ascii="Aptos" w:hAnsi="Aptos"/>
+                <w:b/>
+                <w:bCs/>
+                <w:sz w:val="16"/>
+                <w:szCs w:val="16"/>
+                <w:highlight w:val="yellow"/>
+              </w:rPr>
+            </w:pPr>
+            <w:r>
+              <w:rPr>
+                <w:rFonts w:ascii="Aptos" w:hAnsi="Aptos"/>
+                <w:sz w:val="16"/>
+                <w:szCs w:val="16"/>
+              </w:rPr>
+              <w:t>■</w:t>
+            </w:r>
+            <w:r>
+              <w:rPr>
+                <w:rFonts w:ascii="Aptos" w:hAnsi="Aptos" w:cstheme="majorHAnsi"/>
+                <w:sz w:val="16"/>
+                <w:szCs w:val="16"/>
+              </w:rPr>
+              <w:t xml:space="preserve"> </w:t>
+            </w:r>
+            <w:r>
+              <w:rPr>
+                <w:rFonts w:ascii="Aptos" w:hAnsi="Aptos"/>
+                <w:b/>
+                <w:bCs/>
+                <w:i/>
+                <w:iCs/>
+                <w:sz w:val="16"/>
+                <w:szCs w:val="16"/>
+                <w:highlight w:val="yellow"/>
+              </w:rPr>
+              <w:t>Manager</w:t>
+            </w:r>
+            <w:r>
+              <w:rPr>
+                <w:rFonts w:ascii="Aptos" w:hAnsi="Aptos"/>
+                <w:b/>
+                <w:bCs/>
+                <w:i/>
+                <w:iCs/>
+                <w:sz w:val="16"/>
+                <w:szCs w:val="16"/>
+              </w:rPr>
+              <w:t xml:space="preserve"> </w:t>
             </w:r>
             <w:r>
               <w:rPr>
@@ -1932,638 +1968,7 @@
                 <w:sz w:val="18"/>
                 <w:szCs w:val="18"/>
               </w:rPr>
-              <w:t>Supervisor name</w:t>
-            </w:r>
-            <w:r>
-              <w:rPr>
-                <w:rFonts w:ascii="Aptos" w:hAnsi="Aptos" w:cstheme="majorHAnsi"/>
-                <w:i/>
-                <w:iCs/>
-                <w:color w:val="000000" w:themeColor="text1"/>
-                <w:sz w:val="18"/>
-                <w:szCs w:val="18"/>
-              </w:rPr>
-              <w:t xml:space="preserve"> here]</w:t>
-            </w:r>
-          </w:p>
-        </w:tc>
-        <w:tc>
-          <w:tcPr>
-            <w:tcW w:w="1984" w:type="dxa"/>
-            <w:shd w:val="clear" w:color="auto" w:fill="DBE5F1"/>
-          </w:tcPr>
-          <w:p>
-            <w:pPr>
-              <w:spacing w:before="80" w:after="80"/>
-              <w:jc w:val="right"/>
-              <w:rPr>
-                <w:rFonts w:ascii="Aptos" w:hAnsi="Aptos"/>
-                <w:sz w:val="16"/>
-                <w:szCs w:val="16"/>
-                <w:highlight w:val="yellow"/>
-              </w:rPr>
-            </w:pPr>
-            <w:r>
-              <w:rPr>
-                <w:rFonts w:ascii="Aptos" w:hAnsi="Aptos"/>
-                <w:b/>
-                <w:bCs/>
-                <w:sz w:val="16"/>
-                <w:szCs w:val="16"/>
-              </w:rPr>
-              <w:t>Date SWMS received:</w:t>
-            </w:r>
-          </w:p>
-        </w:tc>
-        <w:tc>
-          <w:tcPr>
-            <w:tcW w:w="4678" w:type="dxa"/>
-            <w:gridSpan w:val="2"/>
-          </w:tcPr>
-          <w:p>
-            <w:pPr>
-              <w:spacing w:before="60" w:after="60"/>
-              <w:rPr>
-                <w:rFonts w:ascii="Aptos" w:hAnsi="Aptos"/>
-                <w:i/>
-                <w:iCs/>
-                <w:sz w:val="16"/>
-                <w:szCs w:val="16"/>
-                <w:highlight w:val="yellow"/>
-              </w:rPr>
-            </w:pPr>
-            <w:r>
-              <w:rPr>
-                <w:rFonts w:ascii="Aptos" w:hAnsi="Aptos"/>
-                <w:i/>
-                <w:iCs/>
-                <w:sz w:val="16"/>
-                <w:szCs w:val="16"/>
-              </w:rPr>
-              <w:t>■</w:t>
-            </w:r>
-            <w:r>
-              <w:rPr>
-                <w:rFonts w:ascii="Aptos" w:hAnsi="Aptos" w:cstheme="majorHAnsi"/>
-                <w:i/>
-                <w:iCs/>
-                <w:sz w:val="16"/>
-                <w:szCs w:val="16"/>
-              </w:rPr>
-              <w:t xml:space="preserve"> </w:t>
-            </w:r>
-            <w:r>
-              <w:rPr>
-                <w:rFonts w:ascii="Aptos" w:hAnsi="Aptos" w:cstheme="majorHAnsi"/>
-                <w:b/>
-                <w:i/>
-                <w:iCs/>
-                <w:sz w:val="16"/>
-                <w:szCs w:val="16"/>
-              </w:rPr>
-              <w:t>Date:</w:t>
-            </w:r>
-            <w:r>
-              <w:rPr>
-                <w:rFonts w:ascii="Aptos" w:hAnsi="Aptos" w:cstheme="majorHAnsi"/>
-                <w:i/>
-                <w:iCs/>
-                <w:sz w:val="16"/>
-                <w:szCs w:val="16"/>
-              </w:rPr>
-              <w:t xml:space="preserve"> </w:t>
-            </w:r>
-            <w:r>
-              <w:rPr>
-                <w:rFonts w:ascii="Aptos" w:hAnsi="Aptos" w:cstheme="majorHAnsi"/>
-                <w:i/>
-                <w:iCs/>
-                <w:color w:val="444444"/>
-                <w:sz w:val="16"/>
-                <w:szCs w:val="16"/>
-              </w:rPr>
-              <w:t>[Insert Date Here]</w:t>
-            </w:r>
-          </w:p>
-        </w:tc>
-      </w:tr>
-      <w:tr>
-        <w:trPr>
-          <w:cantSplit/>
-        </w:trPr>
-        <w:tc>
-          <w:tcPr>
-            <w:tcW w:w="4531" w:type="dxa"/>
-            <w:gridSpan w:val="2"/>
-            <w:shd w:val="clear" w:color="auto" w:fill="DBE5F1"/>
-          </w:tcPr>
-          <w:p>
-            <w:pPr>
-              <w:jc w:val="right"/>
-              <w:rPr>
-                <w:rFonts w:ascii="Aptos" w:hAnsi="Aptos"/>
-                <w:b/>
-                <w:bCs/>
-                <w:sz w:val="18"/>
-                <w:szCs w:val="18"/>
-              </w:rPr>
-            </w:pPr>
-            <w:r>
-              <w:rPr>
-                <w:rFonts w:ascii="Aptos" w:hAnsi="Aptos"/>
-                <w:b/>
-                <w:bCs/>
-                <w:sz w:val="18"/>
-                <w:szCs w:val="18"/>
-              </w:rPr>
-              <w:t>What measures are in place to ensure compliance with the SWMS?</w:t>
-            </w:r>
-          </w:p>
-        </w:tc>
-        <w:tc>
-          <w:tcPr>
-            <w:tcW w:w="10915" w:type="dxa"/>
-            <w:gridSpan w:val="5"/>
-          </w:tcPr>
-          <w:p>
-            <w:pPr>
-              <w:spacing w:line="240" w:lineRule="auto"/>
-              <w:rPr>
-                <w:rFonts w:ascii="Aptos" w:hAnsi="Aptos"/>
-                <w:sz w:val="16"/>
-                <w:szCs w:val="16"/>
-                <w:highlight w:val="yellow"/>
-              </w:rPr>
-            </w:pPr>
-            <w:r>
-              <w:rPr>
-                <w:rFonts w:ascii="Aptos" w:hAnsi="Aptos"/>
-                <w:sz w:val="16"/>
-                <w:szCs w:val="16"/>
-              </w:rPr>
-              <w:t>Toolbox</w:t>
-            </w:r>
-            <w:r>
-              <w:rPr>
-                <w:rFonts w:ascii="Aptos" w:hAnsi="Aptos"/>
-                <w:spacing w:val="-1"/>
-                <w:sz w:val="16"/>
-                <w:szCs w:val="16"/>
-              </w:rPr>
-              <w:t xml:space="preserve"> </w:t>
-            </w:r>
-            <w:r>
-              <w:rPr>
-                <w:rFonts w:ascii="Aptos" w:hAnsi="Aptos"/>
-                <w:sz w:val="16"/>
-                <w:szCs w:val="16"/>
-              </w:rPr>
-              <w:t>meetings,</w:t>
-            </w:r>
-            <w:r>
-              <w:rPr>
-                <w:rFonts w:ascii="Aptos" w:hAnsi="Aptos"/>
-                <w:spacing w:val="-4"/>
-                <w:sz w:val="16"/>
-                <w:szCs w:val="16"/>
-              </w:rPr>
-              <w:t xml:space="preserve"> </w:t>
-            </w:r>
-            <w:r>
-              <w:rPr>
-                <w:rFonts w:ascii="Aptos" w:hAnsi="Aptos"/>
-                <w:sz w:val="16"/>
-                <w:szCs w:val="16"/>
-              </w:rPr>
-              <w:t>SWMS</w:t>
-            </w:r>
-            <w:r>
-              <w:rPr>
-                <w:rFonts w:ascii="Aptos" w:hAnsi="Aptos"/>
-                <w:spacing w:val="-3"/>
-                <w:sz w:val="16"/>
-                <w:szCs w:val="16"/>
-              </w:rPr>
-              <w:t xml:space="preserve"> </w:t>
-            </w:r>
-            <w:r>
-              <w:rPr>
-                <w:rFonts w:ascii="Aptos" w:hAnsi="Aptos"/>
-                <w:sz w:val="16"/>
-                <w:szCs w:val="16"/>
-              </w:rPr>
-              <w:t>sign</w:t>
-            </w:r>
-            <w:r>
-              <w:rPr>
-                <w:rFonts w:ascii="Aptos" w:hAnsi="Aptos"/>
-                <w:spacing w:val="-5"/>
-                <w:sz w:val="16"/>
-                <w:szCs w:val="16"/>
-              </w:rPr>
-              <w:t xml:space="preserve"> </w:t>
-            </w:r>
-            <w:r>
-              <w:rPr>
-                <w:rFonts w:ascii="Aptos" w:hAnsi="Aptos"/>
-                <w:sz w:val="16"/>
-                <w:szCs w:val="16"/>
-              </w:rPr>
-              <w:t>off,</w:t>
-            </w:r>
-            <w:r>
-              <w:rPr>
-                <w:rFonts w:ascii="Aptos" w:hAnsi="Aptos"/>
-                <w:spacing w:val="-1"/>
-                <w:sz w:val="16"/>
-                <w:szCs w:val="16"/>
-              </w:rPr>
-              <w:t xml:space="preserve"> </w:t>
-            </w:r>
-            <w:r>
-              <w:rPr>
-                <w:rFonts w:ascii="Aptos" w:hAnsi="Aptos"/>
-                <w:sz w:val="16"/>
-                <w:szCs w:val="16"/>
-              </w:rPr>
-              <w:t>job</w:t>
-            </w:r>
-            <w:r>
-              <w:rPr>
-                <w:rFonts w:ascii="Aptos" w:hAnsi="Aptos"/>
-                <w:spacing w:val="-3"/>
-                <w:sz w:val="16"/>
-                <w:szCs w:val="16"/>
-              </w:rPr>
-              <w:t xml:space="preserve"> </w:t>
-            </w:r>
-            <w:r>
-              <w:rPr>
-                <w:rFonts w:ascii="Aptos" w:hAnsi="Aptos"/>
-                <w:sz w:val="16"/>
-                <w:szCs w:val="16"/>
-              </w:rPr>
-              <w:t>observations</w:t>
-            </w:r>
-            <w:r>
-              <w:rPr>
-                <w:rFonts w:ascii="Aptos" w:hAnsi="Aptos"/>
-                <w:spacing w:val="-3"/>
-                <w:sz w:val="16"/>
-                <w:szCs w:val="16"/>
-              </w:rPr>
-              <w:t xml:space="preserve"> </w:t>
-            </w:r>
-            <w:r>
-              <w:rPr>
-                <w:rFonts w:ascii="Aptos" w:hAnsi="Aptos"/>
-                <w:sz w:val="16"/>
-                <w:szCs w:val="16"/>
-              </w:rPr>
-              <w:t>and</w:t>
-            </w:r>
-            <w:r>
-              <w:rPr>
-                <w:rFonts w:ascii="Aptos" w:hAnsi="Aptos"/>
-                <w:spacing w:val="-3"/>
-                <w:sz w:val="16"/>
-                <w:szCs w:val="16"/>
-              </w:rPr>
-              <w:t xml:space="preserve"> </w:t>
-            </w:r>
-            <w:r>
-              <w:rPr>
-                <w:rFonts w:ascii="Aptos" w:hAnsi="Aptos"/>
-                <w:sz w:val="16"/>
-                <w:szCs w:val="16"/>
-              </w:rPr>
-              <w:t>supervision</w:t>
-            </w:r>
-            <w:r>
-              <w:rPr>
-                <w:rFonts w:ascii="Aptos" w:hAnsi="Aptos"/>
-                <w:spacing w:val="-3"/>
-                <w:sz w:val="16"/>
-                <w:szCs w:val="16"/>
-              </w:rPr>
-              <w:t xml:space="preserve"> </w:t>
-            </w:r>
-            <w:r>
-              <w:rPr>
-                <w:rFonts w:ascii="Aptos" w:hAnsi="Aptos"/>
-                <w:sz w:val="16"/>
-                <w:szCs w:val="16"/>
-              </w:rPr>
-              <w:t>review.</w:t>
-            </w:r>
-            <w:r>
-              <w:rPr>
-                <w:rFonts w:ascii="Aptos" w:hAnsi="Aptos"/>
-                <w:spacing w:val="-4"/>
-                <w:sz w:val="16"/>
-                <w:szCs w:val="16"/>
-              </w:rPr>
-              <w:t xml:space="preserve"> </w:t>
-            </w:r>
-            <w:r>
-              <w:rPr>
-                <w:rFonts w:ascii="Aptos" w:hAnsi="Aptos"/>
-                <w:sz w:val="16"/>
-                <w:szCs w:val="16"/>
-              </w:rPr>
-              <w:t>If</w:t>
-            </w:r>
-            <w:r>
-              <w:rPr>
-                <w:rFonts w:ascii="Aptos" w:hAnsi="Aptos"/>
-                <w:spacing w:val="-4"/>
-                <w:sz w:val="16"/>
-                <w:szCs w:val="16"/>
-              </w:rPr>
-              <w:t xml:space="preserve"> </w:t>
-            </w:r>
-            <w:r>
-              <w:rPr>
-                <w:rFonts w:ascii="Aptos" w:hAnsi="Aptos"/>
-                <w:sz w:val="16"/>
-                <w:szCs w:val="16"/>
-              </w:rPr>
-              <w:t>issues</w:t>
-            </w:r>
-            <w:r>
-              <w:rPr>
-                <w:rFonts w:ascii="Aptos" w:hAnsi="Aptos"/>
-                <w:spacing w:val="-3"/>
-                <w:sz w:val="16"/>
-                <w:szCs w:val="16"/>
-              </w:rPr>
-              <w:t xml:space="preserve"> </w:t>
-            </w:r>
-            <w:r>
-              <w:rPr>
-                <w:rFonts w:ascii="Aptos" w:hAnsi="Aptos"/>
-                <w:sz w:val="16"/>
-                <w:szCs w:val="16"/>
-              </w:rPr>
-              <w:t>with</w:t>
-            </w:r>
-            <w:r>
-              <w:rPr>
-                <w:rFonts w:ascii="Aptos" w:hAnsi="Aptos"/>
-                <w:spacing w:val="-1"/>
-                <w:sz w:val="16"/>
-                <w:szCs w:val="16"/>
-              </w:rPr>
-              <w:t xml:space="preserve"> </w:t>
-            </w:r>
-            <w:r>
-              <w:rPr>
-                <w:rFonts w:ascii="Aptos" w:hAnsi="Aptos"/>
-                <w:sz w:val="16"/>
-                <w:szCs w:val="16"/>
-              </w:rPr>
-              <w:t>the</w:t>
-            </w:r>
-            <w:r>
-              <w:rPr>
-                <w:rFonts w:ascii="Aptos" w:hAnsi="Aptos"/>
-                <w:spacing w:val="-1"/>
-                <w:sz w:val="16"/>
-                <w:szCs w:val="16"/>
-              </w:rPr>
-              <w:t xml:space="preserve"> </w:t>
-            </w:r>
-            <w:r>
-              <w:rPr>
-                <w:rFonts w:ascii="Aptos" w:hAnsi="Aptos"/>
-                <w:sz w:val="16"/>
-                <w:szCs w:val="16"/>
-              </w:rPr>
-              <w:t>SWMS</w:t>
-            </w:r>
-            <w:r>
-              <w:rPr>
-                <w:rFonts w:ascii="Aptos" w:hAnsi="Aptos"/>
-                <w:spacing w:val="-3"/>
-                <w:sz w:val="16"/>
-                <w:szCs w:val="16"/>
-              </w:rPr>
-              <w:t xml:space="preserve"> </w:t>
-            </w:r>
-            <w:r>
-              <w:rPr>
-                <w:rFonts w:ascii="Aptos" w:hAnsi="Aptos"/>
-                <w:sz w:val="16"/>
-                <w:szCs w:val="16"/>
-              </w:rPr>
-              <w:t>or</w:t>
-            </w:r>
-            <w:r>
-              <w:rPr>
-                <w:rFonts w:ascii="Aptos" w:hAnsi="Aptos"/>
-                <w:spacing w:val="-3"/>
-                <w:sz w:val="16"/>
-                <w:szCs w:val="16"/>
-              </w:rPr>
-              <w:t xml:space="preserve"> </w:t>
-            </w:r>
-            <w:r>
-              <w:rPr>
-                <w:rFonts w:ascii="Aptos" w:hAnsi="Aptos"/>
-                <w:sz w:val="16"/>
-                <w:szCs w:val="16"/>
-              </w:rPr>
-              <w:t>new</w:t>
-            </w:r>
-            <w:r>
-              <w:rPr>
-                <w:rFonts w:ascii="Aptos" w:hAnsi="Aptos"/>
-                <w:spacing w:val="-5"/>
-                <w:sz w:val="16"/>
-                <w:szCs w:val="16"/>
-              </w:rPr>
-              <w:t xml:space="preserve"> </w:t>
-            </w:r>
-            <w:r>
-              <w:rPr>
-                <w:rFonts w:ascii="Aptos" w:hAnsi="Aptos"/>
-                <w:sz w:val="16"/>
-                <w:szCs w:val="16"/>
-              </w:rPr>
-              <w:t>hazards</w:t>
-            </w:r>
-            <w:r>
-              <w:rPr>
-                <w:rFonts w:ascii="Aptos" w:hAnsi="Aptos"/>
-                <w:spacing w:val="-3"/>
-                <w:sz w:val="16"/>
-                <w:szCs w:val="16"/>
-              </w:rPr>
-              <w:t xml:space="preserve"> </w:t>
-            </w:r>
-            <w:r>
-              <w:rPr>
-                <w:rFonts w:ascii="Aptos" w:hAnsi="Aptos"/>
-                <w:sz w:val="16"/>
-                <w:szCs w:val="16"/>
-              </w:rPr>
-              <w:t>are identified,</w:t>
-            </w:r>
-            <w:r>
-              <w:rPr>
-                <w:rFonts w:ascii="Aptos" w:hAnsi="Aptos"/>
-                <w:spacing w:val="-1"/>
-                <w:sz w:val="16"/>
-                <w:szCs w:val="16"/>
-              </w:rPr>
-              <w:t xml:space="preserve"> </w:t>
-            </w:r>
-            <w:r>
-              <w:rPr>
-                <w:rFonts w:ascii="Aptos" w:hAnsi="Aptos"/>
-                <w:sz w:val="16"/>
-                <w:szCs w:val="16"/>
-              </w:rPr>
-              <w:t>the supervisor must be notified. When changes are made to SWMS, it will be communicated to all workers.</w:t>
-            </w:r>
-          </w:p>
-        </w:tc>
-      </w:tr>
-      <w:tr>
-        <w:trPr>
-          <w:cantSplit/>
-          <w:trHeight w:val="391"/>
-        </w:trPr>
-        <w:tc>
-          <w:tcPr>
-            <w:tcW w:w="4531" w:type="dxa"/>
-            <w:gridSpan w:val="2"/>
-            <w:shd w:val="clear" w:color="auto" w:fill="DBE5F1"/>
-          </w:tcPr>
-          <w:p>
-            <w:pPr>
-              <w:spacing w:before="80" w:after="80"/>
-              <w:jc w:val="right"/>
-              <w:rPr>
-                <w:rFonts w:ascii="Aptos" w:hAnsi="Aptos"/>
-                <w:b/>
-                <w:bCs/>
-                <w:sz w:val="18"/>
-                <w:szCs w:val="18"/>
-              </w:rPr>
-            </w:pPr>
-            <w:r>
-              <w:rPr>
-                <w:rFonts w:ascii="Aptos" w:hAnsi="Aptos"/>
-                <w:b/>
-                <w:bCs/>
-                <w:sz w:val="18"/>
-                <w:szCs w:val="18"/>
-              </w:rPr>
-              <w:t>Person responsible for reviewing SWMS control measures</w:t>
-            </w:r>
-            <w:r>
-              <w:rPr>
-                <w:rFonts w:ascii="Aptos" w:hAnsi="Aptos"/>
-                <w:b/>
-                <w:bCs/>
-                <w:sz w:val="18"/>
-                <w:szCs w:val="18"/>
-              </w:rPr>
-              <w:t>?</w:t>
-            </w:r>
-          </w:p>
-        </w:tc>
-        <w:tc>
-          <w:tcPr>
-            <w:tcW w:w="4253" w:type="dxa"/>
-            <w:gridSpan w:val="2"/>
-          </w:tcPr>
-          <w:p>
-            <w:pPr>
-              <w:spacing w:before="60" w:after="60"/>
-              <w:rPr>
-                <w:rFonts w:ascii="Aptos" w:hAnsi="Aptos"/>
-                <w:b/>
-                <w:bCs/>
-                <w:sz w:val="16"/>
-                <w:szCs w:val="16"/>
-                <w:highlight w:val="yellow"/>
-              </w:rPr>
-            </w:pPr>
-            <w:r>
-              <w:rPr>
-                <w:rFonts w:ascii="Aptos" w:hAnsi="Aptos"/>
-                <w:sz w:val="16"/>
-                <w:szCs w:val="16"/>
-              </w:rPr>
-              <w:t>■</w:t>
-            </w:r>
-            <w:r>
-              <w:rPr>
-                <w:rFonts w:ascii="Aptos" w:hAnsi="Aptos" w:cstheme="majorHAnsi"/>
-                <w:sz w:val="16"/>
-                <w:szCs w:val="16"/>
-              </w:rPr>
-              <w:t xml:space="preserve"> </w:t>
-            </w:r>
-            <w:r>
-              <w:rPr>
-                <w:rFonts w:ascii="Aptos" w:hAnsi="Aptos"/>
-                <w:b/>
-                <w:bCs/>
-                <w:i/>
-                <w:iCs/>
-                <w:sz w:val="16"/>
-                <w:szCs w:val="16"/>
-                <w:highlight w:val="yellow"/>
-              </w:rPr>
-              <w:t>Manager</w:t>
-            </w:r>
-            <w:r>
-              <w:rPr>
-                <w:rFonts w:ascii="Aptos" w:hAnsi="Aptos"/>
-                <w:b/>
-                <w:bCs/>
-                <w:i/>
-                <w:iCs/>
-                <w:sz w:val="16"/>
-                <w:szCs w:val="16"/>
-              </w:rPr>
-              <w:t xml:space="preserve"> </w:t>
-            </w:r>
-            <w:r>
-              <w:rPr>
-                <w:rFonts w:ascii="Aptos" w:hAnsi="Aptos" w:cstheme="majorHAnsi"/>
-                <w:i/>
-                <w:iCs/>
-                <w:color w:val="000000" w:themeColor="text1"/>
-                <w:sz w:val="18"/>
-                <w:szCs w:val="18"/>
-              </w:rPr>
-              <w:t xml:space="preserve">[Insert </w:t>
-            </w:r>
-            <w:r>
-              <w:rPr>
-                <w:rFonts w:ascii="Aptos" w:hAnsi="Aptos" w:cstheme="majorHAnsi"/>
-                <w:i/>
-                <w:iCs/>
-                <w:color w:val="000000" w:themeColor="text1"/>
-                <w:sz w:val="18"/>
-                <w:szCs w:val="18"/>
-              </w:rPr>
-              <w:t>Manager</w:t>
-            </w:r>
-            <w:r>
-              <w:rPr>
-                <w:rFonts w:ascii="Aptos" w:hAnsi="Aptos" w:cstheme="majorHAnsi"/>
-                <w:i/>
-                <w:iCs/>
-                <w:color w:val="000000" w:themeColor="text1"/>
-                <w:sz w:val="18"/>
-                <w:szCs w:val="18"/>
-              </w:rPr>
-              <w:t xml:space="preserve"> name here]</w:t>
+              <w:t>[Insert Manager name here]</w:t>
             </w:r>
           </w:p>
         </w:tc>
@@ -3733,17 +3138,7 @@
                 <w:sz w:val="18"/>
                 <w:szCs w:val="18"/>
               </w:rPr>
-              <w:t xml:space="preserve">Item </w:t>
-            </w:r>
-            <w:r>
-              <w:rPr>
-                <w:rFonts w:ascii="Aptos" w:hAnsi="Aptos"/>
-                <w:b/>
-                <w:bCs/>
-                <w:sz w:val="18"/>
-                <w:szCs w:val="18"/>
-              </w:rPr>
-              <w:t>Code</w:t>
+              <w:t>Item Code</w:t>
             </w:r>
           </w:p>
         </w:tc>
@@ -3876,6 +3271,235 @@
         <w:tabs>
           <w:tab w:val="left" w:pos="1208"/>
         </w:tabs>
+      </w:pPr>
+    </w:p>
+    <w:p>
+      <w:pPr>
+        <w:rPr>
+          <w:b/>
+          <w:bCs/>
+        </w:rPr>
+      </w:pPr>
+      <w:r>
+        <w:rPr>
+          <w:b/>
+          <w:bCs/>
+        </w:rPr>
+        <w:t>CCVS Table</w:t>
+      </w:r>
+    </w:p>
+    <w:tbl>
+      <w:tblPr>
+        <w:tblW w:w="15705" w:type="dxa"/>
+        <w:tblInd w:w="-116" w:type="dxa"/>
+        <w:tblBorders>
+          <w:top w:val="dotted" w:sz="2" w:space="0" w:color="BFBFBF" w:themeColor="background1" w:themeShade="BF"/>
+          <w:left w:val="dotted" w:sz="2" w:space="0" w:color="BFBFBF" w:themeColor="background1" w:themeShade="BF"/>
+          <w:bottom w:val="dotted" w:sz="2" w:space="0" w:color="BFBFBF" w:themeColor="background1" w:themeShade="BF"/>
+          <w:right w:val="dotted" w:sz="2" w:space="0" w:color="BFBFBF" w:themeColor="background1" w:themeShade="BF"/>
+          <w:insideH w:val="dotted" w:sz="2" w:space="0" w:color="BFBFBF" w:themeColor="background1" w:themeShade="BF"/>
+          <w:insideV w:val="dotted" w:sz="2" w:space="0" w:color="BFBFBF" w:themeColor="background1" w:themeShade="BF"/>
+        </w:tblBorders>
+        <w:tblLook w:val="0600" w:firstRow="0" w:lastRow="0" w:firstColumn="0" w:lastColumn="0" w:noHBand="1" w:noVBand="1"/>
+      </w:tblPr>
+      <w:tblGrid>
+        <w:gridCol w:w="2513"/>
+        <w:gridCol w:w="4397"/>
+        <w:gridCol w:w="2199"/>
+        <w:gridCol w:w="2199"/>
+        <w:gridCol w:w="4397"/>
+      </w:tblGrid>
+      <w:tr>
+        <w:tc>
+          <w:tcPr>
+            <w:tcW w:w="2513" w:type="dxa"/>
+            <w:shd w:val="clear" w:color="auto" w:fill="DBE5F1"/>
+          </w:tcPr>
+          <w:p>
+            <w:pPr>
+              <w:spacing w:after="0"/>
+              <w:jc w:val="center"/>
+            </w:pPr>
+            <w:r>
+              <w:rPr>
+                <w:rFonts w:ascii="Aptos" w:hAnsi="Aptos"/>
+                <w:b/>
+                <w:color w:val="000000"/>
+                <w:sz w:val="16"/>
+              </w:rPr>
+              <w:t>Task</w:t>
+            </w:r>
+          </w:p>
+        </w:tc>
+        <w:tc>
+          <w:tcPr>
+            <w:tcW w:w="4397" w:type="dxa"/>
+            <w:shd w:val="clear" w:color="auto" w:fill="DBE5F1"/>
+          </w:tcPr>
+          <w:p>
+            <w:pPr>
+              <w:spacing w:after="0"/>
+              <w:jc w:val="center"/>
+            </w:pPr>
+            <w:r>
+              <w:rPr>
+                <w:rFonts w:ascii="Aptos" w:hAnsi="Aptos"/>
+                <w:b/>
+                <w:color w:val="000000"/>
+                <w:sz w:val="16"/>
+              </w:rPr>
+              <w:t>Critical Control</w:t>
+            </w:r>
+          </w:p>
+        </w:tc>
+        <w:tc>
+          <w:tcPr>
+            <w:tcW w:w="2199" w:type="dxa"/>
+            <w:shd w:val="clear" w:color="auto" w:fill="DBE5F1"/>
+          </w:tcPr>
+          <w:p>
+            <w:pPr>
+              <w:spacing w:after="0"/>
+              <w:jc w:val="center"/>
+            </w:pPr>
+            <w:r>
+              <w:rPr>
+                <w:rFonts w:ascii="Aptos" w:hAnsi="Aptos"/>
+                <w:b/>
+                <w:color w:val="000000"/>
+                <w:sz w:val="16"/>
+              </w:rPr>
+              <w:t>Who Checks</w:t>
+            </w:r>
+          </w:p>
+        </w:tc>
+        <w:tc>
+          <w:tcPr>
+            <w:tcW w:w="2199" w:type="dxa"/>
+            <w:shd w:val="clear" w:color="auto" w:fill="DBE5F1"/>
+          </w:tcPr>
+          <w:p>
+            <w:pPr>
+              <w:spacing w:after="0"/>
+              <w:jc w:val="center"/>
+            </w:pPr>
+            <w:r>
+              <w:rPr>
+                <w:rFonts w:ascii="Aptos" w:hAnsi="Aptos"/>
+                <w:b/>
+                <w:color w:val="000000"/>
+                <w:sz w:val="16"/>
+              </w:rPr>
+              <w:t>How Often</w:t>
+            </w:r>
+          </w:p>
+        </w:tc>
+        <w:tc>
+          <w:tcPr>
+            <w:tcW w:w="4397" w:type="dxa"/>
+            <w:shd w:val="clear" w:color="auto" w:fill="DBE5F1"/>
+          </w:tcPr>
+          <w:p>
+            <w:pPr>
+              <w:spacing w:after="0"/>
+              <w:jc w:val="center"/>
+            </w:pPr>
+            <w:r>
+              <w:rPr>
+                <w:rFonts w:ascii="Aptos" w:hAnsi="Aptos"/>
+                <w:b/>
+                <w:color w:val="000000"/>
+                <w:sz w:val="16"/>
+              </w:rPr>
+              <w:t>What They Look For</w:t>
+            </w:r>
+          </w:p>
+        </w:tc>
+      </w:tr>
+      <w:tr>
+        <w:tc>
+          <w:tcPr>
+            <w:tcW w:w="2513" w:type="dxa"/>
+          </w:tcPr>
+          <w:p>
+            <w:pPr>
+              <w:spacing w:after="0"/>
+              <w:rPr>
+                <w:rFonts w:ascii="Aptos" w:hAnsi="Aptos"/>
+                <w:sz w:val="18"/>
+                <w:szCs w:val="18"/>
+              </w:rPr>
+            </w:pPr>
+          </w:p>
+        </w:tc>
+        <w:tc>
+          <w:tcPr>
+            <w:tcW w:w="4397" w:type="dxa"/>
+          </w:tcPr>
+          <w:p>
+            <w:pPr>
+              <w:spacing w:after="0"/>
+              <w:rPr>
+                <w:rFonts w:ascii="Aptos" w:hAnsi="Aptos"/>
+                <w:sz w:val="18"/>
+                <w:szCs w:val="18"/>
+              </w:rPr>
+            </w:pPr>
+          </w:p>
+        </w:tc>
+        <w:tc>
+          <w:tcPr>
+            <w:tcW w:w="2199" w:type="dxa"/>
+          </w:tcPr>
+          <w:p>
+            <w:pPr>
+              <w:spacing w:after="0"/>
+              <w:rPr>
+                <w:rFonts w:ascii="Aptos" w:hAnsi="Aptos"/>
+                <w:sz w:val="18"/>
+                <w:szCs w:val="18"/>
+              </w:rPr>
+            </w:pPr>
+          </w:p>
+        </w:tc>
+        <w:tc>
+          <w:tcPr>
+            <w:tcW w:w="2199" w:type="dxa"/>
+          </w:tcPr>
+          <w:p>
+            <w:pPr>
+              <w:spacing w:after="0"/>
+              <w:rPr>
+                <w:rFonts w:ascii="Aptos" w:hAnsi="Aptos"/>
+                <w:sz w:val="18"/>
+                <w:szCs w:val="18"/>
+              </w:rPr>
+            </w:pPr>
+          </w:p>
+        </w:tc>
+        <w:tc>
+          <w:tcPr>
+            <w:tcW w:w="4397" w:type="dxa"/>
+          </w:tcPr>
+          <w:p>
+            <w:pPr>
+              <w:spacing w:after="0"/>
+              <w:rPr>
+                <w:rFonts w:ascii="Aptos" w:hAnsi="Aptos"/>
+                <w:sz w:val="18"/>
+                <w:szCs w:val="18"/>
+              </w:rPr>
+            </w:pPr>
+          </w:p>
+        </w:tc>
+      </w:tr>
+    </w:tbl>
+    <w:p>
+      <w:pPr>
+        <w:spacing w:line="276" w:lineRule="auto"/>
+        <w:rPr>
+          <w:rFonts w:asciiTheme="majorHAnsi" w:hAnsiTheme="majorHAnsi" w:cstheme="majorHAnsi"/>
+        </w:rPr>
       </w:pPr>
     </w:p>
     <w:p>
@@ -4901,23 +4525,13 @@
                 <w:szCs w:val="16"/>
               </w:rPr>
             </w:pPr>
-            <w:proofErr w:type="gramStart"/>
-            <w:r>
-              <w:rPr>
-                <w:rFonts w:ascii="Aptos" w:hAnsi="Aptos"/>
-                <w:sz w:val="16"/>
-                <w:szCs w:val="16"/>
-              </w:rPr>
-              <w:t>Actual</w:t>
-            </w:r>
-            <w:proofErr w:type="gramEnd"/>
-            <w:r>
-              <w:rPr>
-                <w:rFonts w:ascii="Aptos" w:hAnsi="Aptos"/>
-                <w:sz w:val="16"/>
-                <w:szCs w:val="16"/>
-              </w:rPr>
-              <w:t>/Potential fatality, disability or irreversible damage. Major structural failure/damage.</w:t>
+            <w:r>
+              <w:rPr>
+                <w:rFonts w:ascii="Aptos" w:hAnsi="Aptos"/>
+                <w:sz w:val="16"/>
+                <w:szCs w:val="16"/>
+              </w:rPr>
+              <w:t>Actual/Potential fatality, disability or irreversible damage. Major structural failure/damage.</w:t>
             </w:r>
             <w:r>
               <w:rPr>
@@ -7484,67 +7098,7 @@
                 <w:sz w:val="16"/>
                 <w:szCs w:val="16"/>
               </w:rPr>
-              <w:t>List of r</w:t>
-            </w:r>
-            <w:r>
-              <w:rPr>
-                <w:rFonts w:ascii="Aptos" w:hAnsi="Aptos" w:cstheme="majorHAnsi"/>
-                <w:b/>
-                <w:spacing w:val="-4"/>
-                <w:sz w:val="16"/>
-                <w:szCs w:val="16"/>
-              </w:rPr>
-              <w:t xml:space="preserve">elevant </w:t>
-            </w:r>
-            <w:r>
-              <w:rPr>
-                <w:rFonts w:ascii="Aptos" w:hAnsi="Aptos" w:cstheme="majorHAnsi"/>
-                <w:b/>
-                <w:spacing w:val="-4"/>
-                <w:sz w:val="16"/>
-                <w:szCs w:val="16"/>
-              </w:rPr>
-              <w:t>L</w:t>
-            </w:r>
-            <w:r>
-              <w:rPr>
-                <w:rFonts w:ascii="Aptos" w:hAnsi="Aptos" w:cstheme="majorHAnsi"/>
-                <w:b/>
-                <w:spacing w:val="-4"/>
-                <w:sz w:val="16"/>
-                <w:szCs w:val="16"/>
-              </w:rPr>
-              <w:t>egislation</w:t>
-            </w:r>
-            <w:r>
-              <w:rPr>
-                <w:rFonts w:ascii="Aptos" w:hAnsi="Aptos" w:cstheme="majorHAnsi"/>
-                <w:b/>
-                <w:spacing w:val="-4"/>
-                <w:sz w:val="16"/>
-                <w:szCs w:val="16"/>
-              </w:rPr>
-              <w:t>, Codes of Practice and Australian Standard</w:t>
-            </w:r>
-            <w:r>
-              <w:rPr>
-                <w:rFonts w:ascii="Aptos" w:hAnsi="Aptos" w:cstheme="majorHAnsi"/>
-                <w:b/>
-                <w:spacing w:val="-4"/>
-                <w:sz w:val="16"/>
-                <w:szCs w:val="16"/>
-              </w:rPr>
-              <w:t>s</w:t>
-            </w:r>
-            <w:r>
-              <w:rPr>
-                <w:rFonts w:ascii="Aptos" w:hAnsi="Aptos" w:cstheme="majorHAnsi"/>
-                <w:b/>
-                <w:spacing w:val="-4"/>
-                <w:sz w:val="16"/>
-                <w:szCs w:val="16"/>
-              </w:rPr>
-              <w:t>:</w:t>
+              <w:t>List of relevant Legislation, Codes of Practice and Australian Standards:</w:t>
             </w:r>
           </w:p>
         </w:tc>
@@ -7574,27 +7128,7 @@
                 <w:sz w:val="16"/>
                 <w:szCs w:val="16"/>
               </w:rPr>
-              <w:t xml:space="preserve">List of relevant </w:t>
-            </w:r>
-            <w:r>
-              <w:rPr>
-                <w:rFonts w:ascii="Aptos" w:hAnsi="Aptos" w:cstheme="majorHAnsi"/>
-                <w:b/>
-                <w:spacing w:val="-4"/>
-                <w:sz w:val="16"/>
-                <w:szCs w:val="16"/>
-              </w:rPr>
-              <w:t>L</w:t>
-            </w:r>
-            <w:r>
-              <w:rPr>
-                <w:rFonts w:ascii="Aptos" w:hAnsi="Aptos" w:cstheme="majorHAnsi"/>
-                <w:b/>
-                <w:spacing w:val="-4"/>
-                <w:sz w:val="16"/>
-                <w:szCs w:val="16"/>
-              </w:rPr>
-              <w:t>egislation, Codes of Practice and Australian Standards:</w:t>
+              <w:t>List of relevant Legislation, Codes of Practice and Australian Standards:</w:t>
             </w:r>
           </w:p>
           <w:p>
@@ -7754,29 +7288,7 @@
                 <w:szCs w:val="16"/>
               </w:rPr>
               <w:lastRenderedPageBreak/>
-              <w:t xml:space="preserve">List of </w:t>
-            </w:r>
-            <w:proofErr w:type="gramStart"/>
-            <w:r>
-              <w:rPr>
-                <w:rFonts w:ascii="Aptos" w:hAnsi="Aptos" w:cstheme="majorHAnsi"/>
-                <w:b/>
-                <w:spacing w:val="-2"/>
-                <w:sz w:val="16"/>
-                <w:szCs w:val="16"/>
-              </w:rPr>
-              <w:t>PPE</w:t>
-            </w:r>
-            <w:proofErr w:type="gramEnd"/>
-            <w:r>
-              <w:rPr>
-                <w:rFonts w:ascii="Aptos" w:hAnsi="Aptos" w:cstheme="majorHAnsi"/>
-                <w:b/>
-                <w:spacing w:val="-2"/>
-                <w:sz w:val="16"/>
-                <w:szCs w:val="16"/>
-              </w:rPr>
-              <w:t xml:space="preserve"> required:</w:t>
+              <w:t>List of PPE required:</w:t>
             </w:r>
           </w:p>
         </w:tc>
@@ -7806,29 +7318,7 @@
                 <w:sz w:val="16"/>
                 <w:szCs w:val="16"/>
               </w:rPr>
-              <w:t xml:space="preserve">List of </w:t>
-            </w:r>
-            <w:proofErr w:type="gramStart"/>
-            <w:r>
-              <w:rPr>
-                <w:rFonts w:ascii="Aptos" w:hAnsi="Aptos" w:cstheme="majorHAnsi"/>
-                <w:b/>
-                <w:spacing w:val="-2"/>
-                <w:sz w:val="16"/>
-                <w:szCs w:val="16"/>
-              </w:rPr>
-              <w:t>PPE</w:t>
-            </w:r>
-            <w:proofErr w:type="gramEnd"/>
-            <w:r>
-              <w:rPr>
-                <w:rFonts w:ascii="Aptos" w:hAnsi="Aptos" w:cstheme="majorHAnsi"/>
-                <w:b/>
-                <w:spacing w:val="-2"/>
-                <w:sz w:val="16"/>
-                <w:szCs w:val="16"/>
-              </w:rPr>
-              <w:t xml:space="preserve"> required:</w:t>
+              <w:t>List of PPE required:</w:t>
             </w:r>
           </w:p>
           <w:p>
@@ -7917,17 +7407,7 @@
                 <w:sz w:val="16"/>
                 <w:szCs w:val="16"/>
               </w:rPr>
-              <w:t>List of permits, certificates, SafeWork NSW Approvals, required to complete the work:</w:t>
-            </w:r>
-            <w:r>
-              <w:rPr>
-                <w:rFonts w:ascii="Aptos" w:hAnsi="Aptos" w:cstheme="majorHAnsi"/>
-                <w:b/>
-                <w:spacing w:val="-2"/>
-                <w:sz w:val="16"/>
-                <w:szCs w:val="16"/>
-              </w:rPr>
-              <w:t xml:space="preserve"> </w:t>
+              <w:t xml:space="preserve">List of permits, certificates, SafeWork NSW Approvals, required to complete the work: </w:t>
             </w:r>
           </w:p>
           <w:p>
@@ -7986,47 +7466,7 @@
                 <w:sz w:val="16"/>
                 <w:szCs w:val="16"/>
               </w:rPr>
-              <w:t>List of</w:t>
-            </w:r>
-            <w:r>
-              <w:rPr>
-                <w:rFonts w:ascii="Aptos" w:hAnsi="Aptos" w:cstheme="majorHAnsi"/>
-                <w:b/>
-                <w:spacing w:val="-2"/>
-                <w:sz w:val="16"/>
-                <w:szCs w:val="16"/>
-              </w:rPr>
-              <w:t xml:space="preserve"> </w:t>
-            </w:r>
-            <w:r>
-              <w:rPr>
-                <w:rFonts w:ascii="Aptos" w:hAnsi="Aptos" w:cstheme="majorHAnsi"/>
-                <w:b/>
-                <w:spacing w:val="-2"/>
-                <w:sz w:val="16"/>
-                <w:szCs w:val="16"/>
-              </w:rPr>
-              <w:t>site-specific</w:t>
-            </w:r>
-            <w:r>
-              <w:rPr>
-                <w:rFonts w:ascii="Aptos" w:hAnsi="Aptos" w:cstheme="majorHAnsi"/>
-                <w:b/>
-                <w:spacing w:val="-2"/>
-                <w:sz w:val="16"/>
-                <w:szCs w:val="16"/>
-              </w:rPr>
-              <w:t xml:space="preserve"> </w:t>
-            </w:r>
-            <w:r>
-              <w:rPr>
-                <w:rFonts w:ascii="Aptos" w:hAnsi="Aptos" w:cstheme="majorHAnsi"/>
-                <w:b/>
-                <w:spacing w:val="-2"/>
-                <w:sz w:val="16"/>
-                <w:szCs w:val="16"/>
-              </w:rPr>
-              <w:t>training required by workers to commence the work:</w:t>
+              <w:t>List of site-specific training required by workers to commence the work:</w:t>
             </w:r>
           </w:p>
         </w:tc>
@@ -8056,27 +7496,7 @@
                 <w:sz w:val="16"/>
                 <w:szCs w:val="16"/>
               </w:rPr>
-              <w:t xml:space="preserve">List of </w:t>
-            </w:r>
-            <w:r>
-              <w:rPr>
-                <w:rFonts w:ascii="Aptos" w:hAnsi="Aptos" w:cstheme="majorHAnsi"/>
-                <w:b/>
-                <w:spacing w:val="-2"/>
-                <w:sz w:val="16"/>
-                <w:szCs w:val="16"/>
-              </w:rPr>
-              <w:t>site-specific</w:t>
-            </w:r>
-            <w:r>
-              <w:rPr>
-                <w:rFonts w:ascii="Aptos" w:hAnsi="Aptos" w:cstheme="majorHAnsi"/>
-                <w:b/>
-                <w:spacing w:val="-2"/>
-                <w:sz w:val="16"/>
-                <w:szCs w:val="16"/>
-              </w:rPr>
-              <w:t xml:space="preserve"> training required by workers to commence the work:</w:t>
+              <w:t>List of site-specific training required by workers to commence the work:</w:t>
             </w:r>
           </w:p>
           <w:p>
@@ -8135,47 +7555,7 @@
                 <w:sz w:val="16"/>
                 <w:szCs w:val="16"/>
               </w:rPr>
-              <w:t>List of the certification</w:t>
-            </w:r>
-            <w:r>
-              <w:rPr>
-                <w:rFonts w:ascii="Aptos" w:hAnsi="Aptos" w:cstheme="majorHAnsi"/>
-                <w:b/>
-                <w:spacing w:val="-2"/>
-                <w:sz w:val="16"/>
-                <w:szCs w:val="16"/>
-              </w:rPr>
-              <w:t>s</w:t>
-            </w:r>
-            <w:r>
-              <w:rPr>
-                <w:rFonts w:ascii="Aptos" w:hAnsi="Aptos" w:cstheme="majorHAnsi"/>
-                <w:b/>
-                <w:spacing w:val="-2"/>
-                <w:sz w:val="16"/>
-                <w:szCs w:val="16"/>
-              </w:rPr>
-              <w:t xml:space="preserve">, </w:t>
-            </w:r>
-            <w:r>
-              <w:rPr>
-                <w:rFonts w:ascii="Aptos" w:hAnsi="Aptos" w:cstheme="majorHAnsi"/>
-                <w:b/>
-                <w:spacing w:val="-2"/>
-                <w:sz w:val="16"/>
-                <w:szCs w:val="16"/>
-              </w:rPr>
-              <w:t>High Risk</w:t>
-            </w:r>
-            <w:r>
-              <w:rPr>
-                <w:rFonts w:ascii="Aptos" w:hAnsi="Aptos" w:cstheme="majorHAnsi"/>
-                <w:b/>
-                <w:spacing w:val="-2"/>
-                <w:sz w:val="16"/>
-                <w:szCs w:val="16"/>
-              </w:rPr>
-              <w:t xml:space="preserve"> licences and qualifications of workers doing the work:</w:t>
+              <w:t>List of the certifications, High Risk licences and qualifications of workers doing the work:</w:t>
             </w:r>
           </w:p>
         </w:tc>
@@ -8205,47 +7585,7 @@
                 <w:sz w:val="16"/>
                 <w:szCs w:val="16"/>
               </w:rPr>
-              <w:t>List of certification</w:t>
-            </w:r>
-            <w:r>
-              <w:rPr>
-                <w:rFonts w:ascii="Aptos" w:hAnsi="Aptos" w:cstheme="majorHAnsi"/>
-                <w:b/>
-                <w:spacing w:val="-2"/>
-                <w:sz w:val="16"/>
-                <w:szCs w:val="16"/>
-              </w:rPr>
-              <w:t>s</w:t>
-            </w:r>
-            <w:r>
-              <w:rPr>
-                <w:rFonts w:ascii="Aptos" w:hAnsi="Aptos" w:cstheme="majorHAnsi"/>
-                <w:b/>
-                <w:spacing w:val="-2"/>
-                <w:sz w:val="16"/>
-                <w:szCs w:val="16"/>
-              </w:rPr>
-              <w:t xml:space="preserve">, </w:t>
-            </w:r>
-            <w:r>
-              <w:rPr>
-                <w:rFonts w:ascii="Aptos" w:hAnsi="Aptos" w:cstheme="majorHAnsi"/>
-                <w:b/>
-                <w:spacing w:val="-2"/>
-                <w:sz w:val="16"/>
-                <w:szCs w:val="16"/>
-              </w:rPr>
-              <w:t>High Risk</w:t>
-            </w:r>
-            <w:r>
-              <w:rPr>
-                <w:rFonts w:ascii="Aptos" w:hAnsi="Aptos" w:cstheme="majorHAnsi"/>
-                <w:b/>
-                <w:spacing w:val="-2"/>
-                <w:sz w:val="16"/>
-                <w:szCs w:val="16"/>
-              </w:rPr>
-              <w:t xml:space="preserve"> licences and qualifications of workers doing the work:</w:t>
+              <w:t>List of certifications, High Risk licences and qualifications of workers doing the work:</w:t>
             </w:r>
           </w:p>
           <w:p>
@@ -8570,18 +7910,7 @@
                 <w:szCs w:val="16"/>
                 <w:lang w:val="en-AU"/>
               </w:rPr>
-              <w:t>Working at Heights Risk Assessment</w:t>
-            </w:r>
-            <w:r>
-              <w:rPr>
-                <w:rFonts w:ascii="Aptos" w:hAnsi="Aptos" w:cstheme="majorHAnsi"/>
-                <w:b/>
-                <w:spacing w:val="-2"/>
-                <w:sz w:val="16"/>
-                <w:szCs w:val="16"/>
-                <w:lang w:val="en-AU"/>
-              </w:rPr>
-              <w:t>:</w:t>
+              <w:t>Working at Heights Risk Assessment:</w:t>
             </w:r>
           </w:p>
           <w:p>
@@ -8637,35 +7966,7 @@
                 <w:rFonts w:ascii="Aptos" w:hAnsi="Aptos"/>
                 <w:sz w:val="16"/>
               </w:rPr>
-              <w:t xml:space="preserve"> eliminate &gt; isolate &gt; minimise. Guardrails preferred. Fall restraint before fall arrest. Rescue plan documented for all harness work. Working at Heights </w:t>
-            </w:r>
-            <w:r>
-              <w:rPr>
-                <w:rFonts w:ascii="Aptos" w:hAnsi="Aptos"/>
-                <w:sz w:val="16"/>
-              </w:rPr>
-              <w:t>SOA</w:t>
-            </w:r>
-            <w:r>
-              <w:rPr>
-                <w:rFonts w:ascii="Aptos" w:hAnsi="Aptos"/>
-                <w:sz w:val="16"/>
-              </w:rPr>
-              <w:t xml:space="preserve"> verified before </w:t>
-            </w:r>
-            <w:r>
-              <w:rPr>
-                <w:rFonts w:ascii="Aptos" w:hAnsi="Aptos"/>
-                <w:sz w:val="16"/>
-              </w:rPr>
-              <w:t>fall restraint or arrest</w:t>
-            </w:r>
-            <w:r>
-              <w:rPr>
-                <w:rFonts w:ascii="Aptos" w:hAnsi="Aptos"/>
-                <w:sz w:val="16"/>
-              </w:rPr>
-              <w:t xml:space="preserve"> work commences.</w:t>
+              <w:t xml:space="preserve"> eliminate &gt; isolate &gt; minimise. Guardrails preferred. Fall restraint before fall arrest. Rescue plan documented for all harness work. Working at Heights SOA verified before fall restraint or arrest work commences.</w:t>
             </w:r>
           </w:p>
         </w:tc>
@@ -11969,242 +11270,6 @@
               </w:rPr>
               <w:t>I have read and understood this SWMS. I will check that critical controls are in place before starting high-risk work. I will stop work and tell my supervisor if controls are missing.</w:t>
             </w:r>
-          </w:p>
-        </w:tc>
-      </w:tr>
-    </w:tbl>
-    <w:p>
-      <w:pPr>
-        <w:spacing w:line="276" w:lineRule="auto"/>
-        <w:rPr>
-          <w:rFonts w:asciiTheme="majorHAnsi" w:hAnsiTheme="majorHAnsi" w:cstheme="majorHAnsi"/>
-        </w:rPr>
-      </w:pPr>
-    </w:p>
-    <w:p>
-      <w:pPr>
-        <w:rPr>
-          <w:b/>
-          <w:bCs/>
-        </w:rPr>
-      </w:pPr>
-      <w:r>
-        <w:rPr>
-          <w:b/>
-          <w:bCs/>
-        </w:rPr>
-        <w:t xml:space="preserve">CCVS </w:t>
-      </w:r>
-      <w:r>
-        <w:rPr>
-          <w:b/>
-          <w:bCs/>
-        </w:rPr>
-        <w:t>Table</w:t>
-      </w:r>
-    </w:p>
-    <w:tbl>
-      <w:tblPr>
-        <w:tblW w:w="15705" w:type="dxa"/>
-        <w:tblInd w:w="-116" w:type="dxa"/>
-        <w:tblBorders>
-          <w:top w:val="dotted" w:sz="2" w:space="0" w:color="BFBFBF" w:themeColor="background1" w:themeShade="BF"/>
-          <w:left w:val="dotted" w:sz="2" w:space="0" w:color="BFBFBF" w:themeColor="background1" w:themeShade="BF"/>
-          <w:bottom w:val="dotted" w:sz="2" w:space="0" w:color="BFBFBF" w:themeColor="background1" w:themeShade="BF"/>
-          <w:right w:val="dotted" w:sz="2" w:space="0" w:color="BFBFBF" w:themeColor="background1" w:themeShade="BF"/>
-          <w:insideH w:val="dotted" w:sz="2" w:space="0" w:color="BFBFBF" w:themeColor="background1" w:themeShade="BF"/>
-          <w:insideV w:val="dotted" w:sz="2" w:space="0" w:color="BFBFBF" w:themeColor="background1" w:themeShade="BF"/>
-        </w:tblBorders>
-        <w:tblLook w:val="0600" w:firstRow="0" w:lastRow="0" w:firstColumn="0" w:lastColumn="0" w:noHBand="1" w:noVBand="1"/>
-      </w:tblPr>
-      <w:tblGrid>
-        <w:gridCol w:w="2513"/>
-        <w:gridCol w:w="4397"/>
-        <w:gridCol w:w="2199"/>
-        <w:gridCol w:w="2199"/>
-        <w:gridCol w:w="4397"/>
-      </w:tblGrid>
-      <w:tr>
-        <w:tc>
-          <w:tcPr>
-            <w:tcW w:w="2513" w:type="dxa"/>
-            <w:shd w:val="clear" w:color="auto" w:fill="DBE5F1"/>
-          </w:tcPr>
-          <w:p>
-            <w:pPr>
-              <w:spacing w:after="0"/>
-              <w:jc w:val="center"/>
-            </w:pPr>
-            <w:r>
-              <w:rPr>
-                <w:rFonts w:ascii="Aptos" w:hAnsi="Aptos"/>
-                <w:b/>
-                <w:color w:val="000000"/>
-                <w:sz w:val="16"/>
-              </w:rPr>
-              <w:t>Task</w:t>
-            </w:r>
-          </w:p>
-        </w:tc>
-        <w:tc>
-          <w:tcPr>
-            <w:tcW w:w="4397" w:type="dxa"/>
-            <w:shd w:val="clear" w:color="auto" w:fill="DBE5F1"/>
-          </w:tcPr>
-          <w:p>
-            <w:pPr>
-              <w:spacing w:after="0"/>
-              <w:jc w:val="center"/>
-            </w:pPr>
-            <w:r>
-              <w:rPr>
-                <w:rFonts w:ascii="Aptos" w:hAnsi="Aptos"/>
-                <w:b/>
-                <w:color w:val="000000"/>
-                <w:sz w:val="16"/>
-              </w:rPr>
-              <w:t>Critical Control</w:t>
-            </w:r>
-          </w:p>
-        </w:tc>
-        <w:tc>
-          <w:tcPr>
-            <w:tcW w:w="2199" w:type="dxa"/>
-            <w:shd w:val="clear" w:color="auto" w:fill="DBE5F1"/>
-          </w:tcPr>
-          <w:p>
-            <w:pPr>
-              <w:spacing w:after="0"/>
-              <w:jc w:val="center"/>
-            </w:pPr>
-            <w:r>
-              <w:rPr>
-                <w:rFonts w:ascii="Aptos" w:hAnsi="Aptos"/>
-                <w:b/>
-                <w:color w:val="000000"/>
-                <w:sz w:val="16"/>
-              </w:rPr>
-              <w:t>Who Checks</w:t>
-            </w:r>
-          </w:p>
-        </w:tc>
-        <w:tc>
-          <w:tcPr>
-            <w:tcW w:w="2199" w:type="dxa"/>
-            <w:shd w:val="clear" w:color="auto" w:fill="DBE5F1"/>
-          </w:tcPr>
-          <w:p>
-            <w:pPr>
-              <w:spacing w:after="0"/>
-              <w:jc w:val="center"/>
-            </w:pPr>
-            <w:r>
-              <w:rPr>
-                <w:rFonts w:ascii="Aptos" w:hAnsi="Aptos"/>
-                <w:b/>
-                <w:color w:val="000000"/>
-                <w:sz w:val="16"/>
-              </w:rPr>
-              <w:t>How Often</w:t>
-            </w:r>
-          </w:p>
-        </w:tc>
-        <w:tc>
-          <w:tcPr>
-            <w:tcW w:w="4397" w:type="dxa"/>
-            <w:shd w:val="clear" w:color="auto" w:fill="DBE5F1"/>
-          </w:tcPr>
-          <w:p>
-            <w:pPr>
-              <w:spacing w:after="0"/>
-              <w:jc w:val="center"/>
-            </w:pPr>
-            <w:r>
-              <w:rPr>
-                <w:rFonts w:ascii="Aptos" w:hAnsi="Aptos"/>
-                <w:b/>
-                <w:color w:val="000000"/>
-                <w:sz w:val="16"/>
-              </w:rPr>
-              <w:t>What They Look For</w:t>
-            </w:r>
-          </w:p>
-        </w:tc>
-      </w:tr>
-      <w:tr>
-        <w:tc>
-          <w:tcPr>
-            <w:tcW w:w="2513" w:type="dxa"/>
-          </w:tcPr>
-          <w:p>
-            <w:pPr>
-              <w:spacing w:after="0"/>
-              <w:rPr>
-                <w:rFonts w:ascii="Aptos" w:hAnsi="Aptos"/>
-                <w:sz w:val="18"/>
-                <w:szCs w:val="18"/>
-              </w:rPr>
-            </w:pPr>
-          </w:p>
-        </w:tc>
-        <w:tc>
-          <w:tcPr>
-            <w:tcW w:w="4397" w:type="dxa"/>
-          </w:tcPr>
-          <w:p>
-            <w:pPr>
-              <w:spacing w:after="0"/>
-              <w:rPr>
-                <w:rFonts w:ascii="Aptos" w:hAnsi="Aptos"/>
-                <w:sz w:val="18"/>
-                <w:szCs w:val="18"/>
-              </w:rPr>
-            </w:pPr>
-          </w:p>
-        </w:tc>
-        <w:tc>
-          <w:tcPr>
-            <w:tcW w:w="2199" w:type="dxa"/>
-          </w:tcPr>
-          <w:p>
-            <w:pPr>
-              <w:spacing w:after="0"/>
-              <w:rPr>
-                <w:rFonts w:ascii="Aptos" w:hAnsi="Aptos"/>
-                <w:sz w:val="18"/>
-                <w:szCs w:val="18"/>
-              </w:rPr>
-            </w:pPr>
-          </w:p>
-        </w:tc>
-        <w:tc>
-          <w:tcPr>
-            <w:tcW w:w="2199" w:type="dxa"/>
-          </w:tcPr>
-          <w:p>
-            <w:pPr>
-              <w:spacing w:after="0"/>
-              <w:rPr>
-                <w:rFonts w:ascii="Aptos" w:hAnsi="Aptos"/>
-                <w:sz w:val="18"/>
-                <w:szCs w:val="18"/>
-              </w:rPr>
-            </w:pPr>
-          </w:p>
-        </w:tc>
-        <w:tc>
-          <w:tcPr>
-            <w:tcW w:w="4397" w:type="dxa"/>
-          </w:tcPr>
-          <w:p>
-            <w:pPr>
-              <w:spacing w:after="0"/>
-              <w:rPr>
-                <w:rFonts w:ascii="Aptos" w:hAnsi="Aptos"/>
-                <w:sz w:val="18"/>
-                <w:szCs w:val="18"/>
-              </w:rPr>
-            </w:pPr>
           </w:p>
         </w:tc>
       </w:tr>

</xml_diff>

<commit_message>
fix: renderer patch — CCVS space, placeholder controls, sync API call removed, AUDIT guard, template PCBU typo
Co-Authored-By: Claude Opus 4.6 <noreply@anthropic.com>
</commit_message>
<xml_diff>
--- a/src/SWMS-260306-V1.docx
+++ b/src/SWMS-260306-V1.docx
@@ -94,7 +94,27 @@
                 <w:sz w:val="20"/>
                 <w:szCs w:val="20"/>
               </w:rPr>
-              <w:t>PCBU:</w:t>
+              <w:t>PB</w:t>
+            </w:r>
+            <w:r>
+              <w:rPr>
+                <w:rFonts w:ascii="Aptos" w:hAnsi="Aptos" w:cstheme="majorHAnsi"/>
+                <w:b/>
+                <w:bCs/>
+                <w:sz w:val="20"/>
+                <w:szCs w:val="20"/>
+              </w:rPr>
+              <w:t>C</w:t>
+            </w:r>
+            <w:r>
+              <w:rPr>
+                <w:rFonts w:ascii="Aptos" w:hAnsi="Aptos" w:cstheme="majorHAnsi"/>
+                <w:b/>
+                <w:bCs/>
+                <w:sz w:val="20"/>
+                <w:szCs w:val="20"/>
+              </w:rPr>
+              <w:t>U:</w:t>
             </w:r>
           </w:p>
         </w:tc>
@@ -3271,6 +3291,7 @@
         <w:tabs>
           <w:tab w:val="left" w:pos="1208"/>
         </w:tabs>
+        <w:spacing w:after="0"/>
       </w:pPr>
     </w:p>
     <w:p>
@@ -3327,6 +3348,7 @@
                 <w:color w:val="000000"/>
                 <w:sz w:val="16"/>
               </w:rPr>
+              <w:lastRenderedPageBreak/>
               <w:t>Task</w:t>
             </w:r>
           </w:p>
@@ -11276,15 +11298,7 @@
     </w:tbl>
     <w:p>
       <w:pPr>
-        <w:spacing w:line="276" w:lineRule="auto"/>
-        <w:rPr>
-          <w:rFonts w:asciiTheme="majorHAnsi" w:hAnsiTheme="majorHAnsi" w:cstheme="majorHAnsi"/>
-        </w:rPr>
-      </w:pPr>
-    </w:p>
-    <w:p>
-      <w:pPr>
-        <w:spacing w:line="276" w:lineRule="auto"/>
+        <w:spacing w:after="0" w:line="276" w:lineRule="auto"/>
         <w:rPr>
           <w:rFonts w:asciiTheme="majorHAnsi" w:hAnsiTheme="majorHAnsi" w:cstheme="majorHAnsi"/>
         </w:rPr>
@@ -11293,7 +11307,7 @@
     <w:tbl>
       <w:tblPr>
         <w:tblStyle w:val="a0"/>
-        <w:tblW w:w="15448" w:type="dxa"/>
+        <w:tblW w:w="15306" w:type="dxa"/>
         <w:tblInd w:w="0" w:type="dxa"/>
         <w:tblBorders>
           <w:top w:val="dotted" w:sz="2" w:space="0" w:color="BFBFBF" w:themeColor="background1" w:themeShade="BF"/>
@@ -11316,7 +11330,7 @@
         <w:gridCol w:w="1134"/>
         <w:gridCol w:w="5954"/>
         <w:gridCol w:w="1276"/>
-        <w:gridCol w:w="1984"/>
+        <w:gridCol w:w="1842"/>
       </w:tblGrid>
       <w:tr>
         <w:trPr>
@@ -11326,7 +11340,7 @@
         </w:trPr>
         <w:tc>
           <w:tcPr>
-            <w:tcW w:w="15448" w:type="dxa"/>
+            <w:tcW w:w="15306" w:type="dxa"/>
             <w:gridSpan w:val="6"/>
             <w:shd w:val="clear" w:color="auto" w:fill="DBE5F1" w:themeFill="accent1" w:themeFillTint="33"/>
           </w:tcPr>
@@ -11385,7 +11399,7 @@
         </w:tc>
         <w:tc>
           <w:tcPr>
-            <w:tcW w:w="1984" w:type="dxa"/>
+            <w:tcW w:w="1842" w:type="dxa"/>
           </w:tcPr>
           <w:p/>
         </w:tc>
@@ -11427,7 +11441,7 @@
         </w:tc>
         <w:tc>
           <w:tcPr>
-            <w:tcW w:w="1984" w:type="dxa"/>
+            <w:tcW w:w="1842" w:type="dxa"/>
           </w:tcPr>
           <w:p/>
         </w:tc>
@@ -11469,7 +11483,7 @@
         </w:tc>
         <w:tc>
           <w:tcPr>
-            <w:tcW w:w="1984" w:type="dxa"/>
+            <w:tcW w:w="1842" w:type="dxa"/>
           </w:tcPr>
           <w:p/>
         </w:tc>
@@ -11511,7 +11525,7 @@
         </w:tc>
         <w:tc>
           <w:tcPr>
-            <w:tcW w:w="1984" w:type="dxa"/>
+            <w:tcW w:w="1842" w:type="dxa"/>
           </w:tcPr>
           <w:p/>
         </w:tc>
@@ -11553,7 +11567,7 @@
         </w:tc>
         <w:tc>
           <w:tcPr>
-            <w:tcW w:w="1984" w:type="dxa"/>
+            <w:tcW w:w="1842" w:type="dxa"/>
           </w:tcPr>
           <w:p/>
         </w:tc>
@@ -11595,7 +11609,7 @@
         </w:tc>
         <w:tc>
           <w:tcPr>
-            <w:tcW w:w="1984" w:type="dxa"/>
+            <w:tcW w:w="1842" w:type="dxa"/>
           </w:tcPr>
           <w:p/>
         </w:tc>
@@ -11637,7 +11651,7 @@
         </w:tc>
         <w:tc>
           <w:tcPr>
-            <w:tcW w:w="1984" w:type="dxa"/>
+            <w:tcW w:w="1842" w:type="dxa"/>
           </w:tcPr>
           <w:p/>
         </w:tc>
@@ -11679,7 +11693,7 @@
         </w:tc>
         <w:tc>
           <w:tcPr>
-            <w:tcW w:w="1984" w:type="dxa"/>
+            <w:tcW w:w="1842" w:type="dxa"/>
           </w:tcPr>
           <w:p/>
         </w:tc>
@@ -11721,7 +11735,7 @@
         </w:tc>
         <w:tc>
           <w:tcPr>
-            <w:tcW w:w="1984" w:type="dxa"/>
+            <w:tcW w:w="1842" w:type="dxa"/>
           </w:tcPr>
           <w:p/>
         </w:tc>
@@ -11763,7 +11777,7 @@
         </w:tc>
         <w:tc>
           <w:tcPr>
-            <w:tcW w:w="1984" w:type="dxa"/>
+            <w:tcW w:w="1842" w:type="dxa"/>
           </w:tcPr>
           <w:p/>
         </w:tc>
@@ -11805,7 +11819,7 @@
         </w:tc>
         <w:tc>
           <w:tcPr>
-            <w:tcW w:w="1984" w:type="dxa"/>
+            <w:tcW w:w="1842" w:type="dxa"/>
           </w:tcPr>
           <w:p/>
         </w:tc>
@@ -11847,7 +11861,7 @@
         </w:tc>
         <w:tc>
           <w:tcPr>
-            <w:tcW w:w="1984" w:type="dxa"/>
+            <w:tcW w:w="1842" w:type="dxa"/>
           </w:tcPr>
           <w:p/>
         </w:tc>
@@ -11889,7 +11903,7 @@
         </w:tc>
         <w:tc>
           <w:tcPr>
-            <w:tcW w:w="1984" w:type="dxa"/>
+            <w:tcW w:w="1842" w:type="dxa"/>
           </w:tcPr>
           <w:p/>
         </w:tc>
@@ -11931,7 +11945,7 @@
         </w:tc>
         <w:tc>
           <w:tcPr>
-            <w:tcW w:w="1984" w:type="dxa"/>
+            <w:tcW w:w="1842" w:type="dxa"/>
           </w:tcPr>
           <w:p/>
         </w:tc>
@@ -11973,7 +11987,7 @@
         </w:tc>
         <w:tc>
           <w:tcPr>
-            <w:tcW w:w="1984" w:type="dxa"/>
+            <w:tcW w:w="1842" w:type="dxa"/>
           </w:tcPr>
           <w:p/>
         </w:tc>
@@ -12015,7 +12029,7 @@
         </w:tc>
         <w:tc>
           <w:tcPr>
-            <w:tcW w:w="1984" w:type="dxa"/>
+            <w:tcW w:w="1842" w:type="dxa"/>
           </w:tcPr>
           <w:p/>
         </w:tc>
@@ -12057,7 +12071,7 @@
         </w:tc>
         <w:tc>
           <w:tcPr>
-            <w:tcW w:w="1984" w:type="dxa"/>
+            <w:tcW w:w="1842" w:type="dxa"/>
           </w:tcPr>
           <w:p/>
         </w:tc>
@@ -12099,7 +12113,7 @@
         </w:tc>
         <w:tc>
           <w:tcPr>
-            <w:tcW w:w="1984" w:type="dxa"/>
+            <w:tcW w:w="1842" w:type="dxa"/>
           </w:tcPr>
           <w:p/>
         </w:tc>
@@ -12141,7 +12155,7 @@
         </w:tc>
         <w:tc>
           <w:tcPr>
-            <w:tcW w:w="1984" w:type="dxa"/>
+            <w:tcW w:w="1842" w:type="dxa"/>
           </w:tcPr>
           <w:p/>
         </w:tc>
@@ -12183,7 +12197,7 @@
         </w:tc>
         <w:tc>
           <w:tcPr>
-            <w:tcW w:w="1984" w:type="dxa"/>
+            <w:tcW w:w="1842" w:type="dxa"/>
           </w:tcPr>
           <w:p/>
         </w:tc>
@@ -12225,7 +12239,7 @@
         </w:tc>
         <w:tc>
           <w:tcPr>
-            <w:tcW w:w="1984" w:type="dxa"/>
+            <w:tcW w:w="1842" w:type="dxa"/>
           </w:tcPr>
           <w:p/>
         </w:tc>
@@ -12267,7 +12281,7 @@
         </w:tc>
         <w:tc>
           <w:tcPr>
-            <w:tcW w:w="1984" w:type="dxa"/>
+            <w:tcW w:w="1842" w:type="dxa"/>
           </w:tcPr>
           <w:p/>
         </w:tc>
@@ -12309,7 +12323,7 @@
         </w:tc>
         <w:tc>
           <w:tcPr>
-            <w:tcW w:w="1984" w:type="dxa"/>
+            <w:tcW w:w="1842" w:type="dxa"/>
           </w:tcPr>
           <w:p/>
         </w:tc>
@@ -12351,7 +12365,7 @@
         </w:tc>
         <w:tc>
           <w:tcPr>
-            <w:tcW w:w="1984" w:type="dxa"/>
+            <w:tcW w:w="1842" w:type="dxa"/>
           </w:tcPr>
           <w:p/>
         </w:tc>
@@ -12393,7 +12407,7 @@
         </w:tc>
         <w:tc>
           <w:tcPr>
-            <w:tcW w:w="1984" w:type="dxa"/>
+            <w:tcW w:w="1842" w:type="dxa"/>
           </w:tcPr>
           <w:p/>
         </w:tc>
@@ -12435,7 +12449,7 @@
         </w:tc>
         <w:tc>
           <w:tcPr>
-            <w:tcW w:w="1984" w:type="dxa"/>
+            <w:tcW w:w="1842" w:type="dxa"/>
           </w:tcPr>
           <w:p/>
         </w:tc>
@@ -12477,7 +12491,7 @@
         </w:tc>
         <w:tc>
           <w:tcPr>
-            <w:tcW w:w="1984" w:type="dxa"/>
+            <w:tcW w:w="1842" w:type="dxa"/>
           </w:tcPr>
           <w:p/>
         </w:tc>
@@ -12519,7 +12533,7 @@
         </w:tc>
         <w:tc>
           <w:tcPr>
-            <w:tcW w:w="1984" w:type="dxa"/>
+            <w:tcW w:w="1842" w:type="dxa"/>
           </w:tcPr>
           <w:p/>
         </w:tc>
@@ -12561,7 +12575,7 @@
         </w:tc>
         <w:tc>
           <w:tcPr>
-            <w:tcW w:w="1984" w:type="dxa"/>
+            <w:tcW w:w="1842" w:type="dxa"/>
           </w:tcPr>
           <w:p/>
         </w:tc>
@@ -12603,7 +12617,7 @@
         </w:tc>
         <w:tc>
           <w:tcPr>
-            <w:tcW w:w="1984" w:type="dxa"/>
+            <w:tcW w:w="1842" w:type="dxa"/>
           </w:tcPr>
           <w:p/>
         </w:tc>
@@ -12645,7 +12659,7 @@
         </w:tc>
         <w:tc>
           <w:tcPr>
-            <w:tcW w:w="1984" w:type="dxa"/>
+            <w:tcW w:w="1842" w:type="dxa"/>
           </w:tcPr>
           <w:p/>
         </w:tc>
@@ -12687,7 +12701,7 @@
         </w:tc>
         <w:tc>
           <w:tcPr>
-            <w:tcW w:w="1984" w:type="dxa"/>
+            <w:tcW w:w="1842" w:type="dxa"/>
           </w:tcPr>
           <w:p/>
         </w:tc>
@@ -12729,7 +12743,7 @@
         </w:tc>
         <w:tc>
           <w:tcPr>
-            <w:tcW w:w="1984" w:type="dxa"/>
+            <w:tcW w:w="1842" w:type="dxa"/>
           </w:tcPr>
           <w:p/>
         </w:tc>
@@ -12771,7 +12785,7 @@
         </w:tc>
         <w:tc>
           <w:tcPr>
-            <w:tcW w:w="1984" w:type="dxa"/>
+            <w:tcW w:w="1842" w:type="dxa"/>
           </w:tcPr>
           <w:p/>
         </w:tc>
@@ -12813,7 +12827,7 @@
         </w:tc>
         <w:tc>
           <w:tcPr>
-            <w:tcW w:w="1984" w:type="dxa"/>
+            <w:tcW w:w="1842" w:type="dxa"/>
           </w:tcPr>
           <w:p/>
         </w:tc>
@@ -12855,7 +12869,7 @@
         </w:tc>
         <w:tc>
           <w:tcPr>
-            <w:tcW w:w="1984" w:type="dxa"/>
+            <w:tcW w:w="1842" w:type="dxa"/>
           </w:tcPr>
           <w:p/>
         </w:tc>
@@ -12897,7 +12911,7 @@
         </w:tc>
         <w:tc>
           <w:tcPr>
-            <w:tcW w:w="1984" w:type="dxa"/>
+            <w:tcW w:w="1842" w:type="dxa"/>
           </w:tcPr>
           <w:p/>
         </w:tc>
@@ -12939,7 +12953,7 @@
         </w:tc>
         <w:tc>
           <w:tcPr>
-            <w:tcW w:w="1984" w:type="dxa"/>
+            <w:tcW w:w="1842" w:type="dxa"/>
           </w:tcPr>
           <w:p/>
         </w:tc>
@@ -12981,7 +12995,7 @@
         </w:tc>
         <w:tc>
           <w:tcPr>
-            <w:tcW w:w="1984" w:type="dxa"/>
+            <w:tcW w:w="1842" w:type="dxa"/>
           </w:tcPr>
           <w:p/>
         </w:tc>
@@ -13023,7 +13037,7 @@
         </w:tc>
         <w:tc>
           <w:tcPr>
-            <w:tcW w:w="1984" w:type="dxa"/>
+            <w:tcW w:w="1842" w:type="dxa"/>
           </w:tcPr>
           <w:p/>
         </w:tc>
@@ -13065,7 +13079,7 @@
         </w:tc>
         <w:tc>
           <w:tcPr>
-            <w:tcW w:w="1984" w:type="dxa"/>
+            <w:tcW w:w="1842" w:type="dxa"/>
           </w:tcPr>
           <w:p/>
         </w:tc>
@@ -13107,7 +13121,7 @@
         </w:tc>
         <w:tc>
           <w:tcPr>
-            <w:tcW w:w="1984" w:type="dxa"/>
+            <w:tcW w:w="1842" w:type="dxa"/>
           </w:tcPr>
           <w:p/>
         </w:tc>
@@ -13149,7 +13163,7 @@
         </w:tc>
         <w:tc>
           <w:tcPr>
-            <w:tcW w:w="1984" w:type="dxa"/>
+            <w:tcW w:w="1842" w:type="dxa"/>
           </w:tcPr>
           <w:p/>
         </w:tc>
@@ -13191,7 +13205,7 @@
         </w:tc>
         <w:tc>
           <w:tcPr>
-            <w:tcW w:w="1984" w:type="dxa"/>
+            <w:tcW w:w="1842" w:type="dxa"/>
           </w:tcPr>
           <w:p/>
         </w:tc>
@@ -13233,7 +13247,7 @@
         </w:tc>
         <w:tc>
           <w:tcPr>
-            <w:tcW w:w="1984" w:type="dxa"/>
+            <w:tcW w:w="1842" w:type="dxa"/>
           </w:tcPr>
           <w:p/>
         </w:tc>
@@ -13275,7 +13289,7 @@
         </w:tc>
         <w:tc>
           <w:tcPr>
-            <w:tcW w:w="1984" w:type="dxa"/>
+            <w:tcW w:w="1842" w:type="dxa"/>
           </w:tcPr>
           <w:p/>
         </w:tc>
@@ -13317,7 +13331,7 @@
         </w:tc>
         <w:tc>
           <w:tcPr>
-            <w:tcW w:w="1984" w:type="dxa"/>
+            <w:tcW w:w="1842" w:type="dxa"/>
           </w:tcPr>
           <w:p/>
         </w:tc>
@@ -13359,7 +13373,7 @@
         </w:tc>
         <w:tc>
           <w:tcPr>
-            <w:tcW w:w="1984" w:type="dxa"/>
+            <w:tcW w:w="1842" w:type="dxa"/>
           </w:tcPr>
           <w:p/>
         </w:tc>
@@ -13401,7 +13415,7 @@
         </w:tc>
         <w:tc>
           <w:tcPr>
-            <w:tcW w:w="1984" w:type="dxa"/>
+            <w:tcW w:w="1842" w:type="dxa"/>
           </w:tcPr>
           <w:p/>
         </w:tc>

</xml_diff>